<commit_message>
Modified template slightly according to client feedback
</commit_message>
<xml_diff>
--- a/docxGenerator/Output.docx
+++ b/docxGenerator/Output.docx
@@ -39,7 +39,7 @@
         <w:pStyle w:val="Heading2"/>
         <w:numPr>
           <w:ilvl w:val="1"/>
-          <w:numId w:val="15"/>
+          <w:numId w:val="11"/>
         </w:numPr>
         <w:rPr/>
       </w:pPr>
@@ -93,7 +93,7 @@
           <w:szCs w:val="18"/>
           <w:lang w:val="en-GB"/>
         </w:rPr>
-        <w:t>Machinenummer:</w:t>
+        <w:t>Contactpersoon:</w:t>
       </w:r>
       <w:r>
         <w:rPr>
@@ -101,7 +101,7 @@
           <w:szCs w:val="18"/>
           <w:lang w:val="en-GB"/>
         </w:rPr>
-        <w:t xml:space="preserve"> MCH-2024-00158</w:t>
+        <w:t xml:space="preserve"> Peter Brown</w:t>
       </w:r>
     </w:p>
     <w:p>
@@ -125,7 +125,7 @@
           <w:szCs w:val="18"/>
           <w:lang w:val="en-GB"/>
         </w:rPr>
-        <w:t>Contactpersoon:</w:t>
+        <w:t>Telefoonnummer en/of email:</w:t>
       </w:r>
       <w:r>
         <w:rPr>
@@ -133,7 +133,7 @@
           <w:szCs w:val="18"/>
           <w:lang w:val="en-GB"/>
         </w:rPr>
-        <w:t xml:space="preserve"> Peter Brown</w:t>
+        <w:t xml:space="preserve"> peter.brown@example.com / +31 6 12345678</w:t>
       </w:r>
     </w:p>
     <w:p>
@@ -146,6 +146,64 @@
         <w:rPr>
           <w:sz w:val="18"/>
           <w:szCs w:val="18"/>
+        </w:rPr>
+      </w:pPr>
+      <w:r>
+        <w:rPr>
+          <w:b/>
+          <w:bCs/>
+          <w:sz w:val="18"/>
+          <w:szCs w:val="18"/>
+        </w:rPr>
+        <w:t>Contactpersoon aanwezig bij de klant:</w:t>
+      </w:r>
+      <w:r>
+        <w:rPr>
+          <w:sz w:val="18"/>
+          <w:szCs w:val="18"/>
+        </w:rPr>
+        <w:t xml:space="preserve"> Anna Miller</w:t>
+      </w:r>
+    </w:p>
+    <w:p>
+      <w:pPr>
+        <w:pStyle w:val="ListParagraph"/>
+        <w:numPr>
+          <w:ilvl w:val="0"/>
+          <w:numId w:val="3"/>
+        </w:numPr>
+        <w:rPr>
+          <w:sz w:val="18"/>
+          <w:szCs w:val="18"/>
+        </w:rPr>
+      </w:pPr>
+      <w:r>
+        <w:rPr>
+          <w:b/>
+          <w:bCs/>
+          <w:sz w:val="18"/>
+          <w:szCs w:val="18"/>
+        </w:rPr>
+        <w:t>Urgent?</w:t>
+      </w:r>
+      <w:r>
+        <w:rPr>
+          <w:sz w:val="18"/>
+          <w:szCs w:val="18"/>
+        </w:rPr>
+        <w:t xml:space="preserve"> yes</w:t>
+      </w:r>
+    </w:p>
+    <w:p>
+      <w:pPr>
+        <w:pStyle w:val="ListParagraph"/>
+        <w:numPr>
+          <w:ilvl w:val="0"/>
+          <w:numId w:val="3"/>
+        </w:numPr>
+        <w:rPr>
+          <w:sz w:val="18"/>
+          <w:szCs w:val="18"/>
           <w:lang w:val="en-GB"/>
         </w:rPr>
       </w:pPr>
@@ -157,111 +215,20 @@
           <w:szCs w:val="18"/>
           <w:lang w:val="en-GB"/>
         </w:rPr>
-        <w:t>Telefoonnummer en/of email:</w:t>
+        <w:t>Service Informatieblad beschikbaar voor eerstelijnsadvies:</w:t>
       </w:r>
       <w:r>
         <w:rPr>
           <w:sz w:val="18"/>
           <w:szCs w:val="18"/>
           <w:lang w:val="en-GB"/>
-        </w:rPr>
-        <w:t xml:space="preserve"> peter.brown@example.com / +31 6 12345678</w:t>
-      </w:r>
-    </w:p>
-    <w:p>
-      <w:pPr>
-        <w:pStyle w:val="ListParagraph"/>
-        <w:numPr>
-          <w:ilvl w:val="0"/>
-          <w:numId w:val="3"/>
-        </w:numPr>
-        <w:rPr>
-          <w:sz w:val="18"/>
-          <w:szCs w:val="18"/>
-        </w:rPr>
-      </w:pPr>
-      <w:r>
-        <w:rPr>
-          <w:b/>
-          <w:bCs/>
-          <w:sz w:val="18"/>
-          <w:szCs w:val="18"/>
-        </w:rPr>
-        <w:t>Contactpersoon aanwezig bij de klant:</w:t>
-      </w:r>
-      <w:r>
-        <w:rPr>
-          <w:sz w:val="18"/>
-          <w:szCs w:val="18"/>
-        </w:rPr>
-        <w:t xml:space="preserve"> Anna Miller</w:t>
-      </w:r>
-    </w:p>
-    <w:p>
-      <w:pPr>
-        <w:pStyle w:val="ListParagraph"/>
-        <w:numPr>
-          <w:ilvl w:val="0"/>
-          <w:numId w:val="3"/>
-        </w:numPr>
-        <w:rPr>
-          <w:sz w:val="18"/>
-          <w:szCs w:val="18"/>
-        </w:rPr>
-      </w:pPr>
-      <w:r>
-        <w:rPr>
-          <w:b/>
-          <w:bCs/>
-          <w:sz w:val="18"/>
-          <w:szCs w:val="18"/>
-        </w:rPr>
-        <w:t>Probleem omschrijving:</w:t>
-      </w:r>
-      <w:r>
-        <w:rPr>
-          <w:sz w:val="18"/>
-          <w:szCs w:val="18"/>
-        </w:rPr>
-        <w:t xml:space="preserve"> The machine stops during production after approximately 20 minutes. Error code E204 appears on the control panel. After restarting, the machine works temporarily, but the problem returns.</w:t>
-      </w:r>
-    </w:p>
-    <w:p>
-      <w:pPr>
-        <w:pStyle w:val="ListParagraph"/>
-        <w:numPr>
-          <w:ilvl w:val="0"/>
-          <w:numId w:val="3"/>
-        </w:numPr>
-        <w:rPr>
-          <w:sz w:val="18"/>
-          <w:szCs w:val="18"/>
-        </w:rPr>
-      </w:pPr>
-      <w:r>
-        <w:rPr>
-          <w:b/>
-          <w:bCs/>
-          <w:sz w:val="18"/>
-          <w:szCs w:val="18"/>
-        </w:rPr>
-        <w:t>Urgent?</w:t>
-      </w:r>
-      <w:r>
-        <w:rPr>
-          <w:sz w:val="18"/>
-          <w:szCs w:val="18"/>
         </w:rPr>
         <w:t xml:space="preserve"> yes</w:t>
       </w:r>
     </w:p>
     <w:p>
       <w:pPr>
-        <w:pStyle w:val="ListParagraph"/>
-        <w:numPr>
-          <w:ilvl w:val="0"/>
-          <w:numId w:val="3"/>
-        </w:numPr>
+        <w:pStyle w:val="Normal"/>
         <w:rPr>
           <w:sz w:val="18"/>
           <w:szCs w:val="18"/>
@@ -270,116 +237,10 @@
       </w:pPr>
       <w:r>
         <w:rPr>
-          <w:b/>
-          <w:bCs/>
           <w:sz w:val="18"/>
           <w:szCs w:val="18"/>
           <w:lang w:val="en-GB"/>
         </w:rPr>
-        <w:t>Service Informatieblad beschikbaar voor eerstelijnsadvies:</w:t>
-      </w:r>
-      <w:r>
-        <w:rPr>
-          <w:sz w:val="18"/>
-          <w:szCs w:val="18"/>
-          <w:lang w:val="en-GB"/>
-        </w:rPr>
-        <w:t xml:space="preserve"> yes</w:t>
-      </w:r>
-    </w:p>
-    <w:p>
-      <w:pPr>
-        <w:pStyle w:val="Normal"/>
-        <w:rPr>
-          <w:sz w:val="18"/>
-          <w:szCs w:val="18"/>
-          <w:lang w:val="en-GB"/>
-        </w:rPr>
-      </w:pPr>
-      <w:r>
-        <w:rPr>
-          <w:sz w:val="18"/>
-          <w:szCs w:val="18"/>
-          <w:lang w:val="en-GB"/>
-        </w:rPr>
-      </w:r>
-    </w:p>
-    <w:p>
-      <w:pPr>
-        <w:pStyle w:val="Normal"/>
-        <w:rPr>
-          <w:sz w:val="18"/>
-          <w:szCs w:val="18"/>
-          <w:lang w:val="en-GB"/>
-        </w:rPr>
-      </w:pPr>
-      <w:r>
-        <w:rPr>
-          <w:sz w:val="18"/>
-          <w:szCs w:val="18"/>
-          <w:lang w:val="en-GB"/>
-        </w:rPr>
-        <w:t>Service Informatiebladen voor Service processen:</w:t>
-      </w:r>
-    </w:p>
-    <w:p>
-      <w:pPr>
-        <w:pStyle w:val="ListParagraph"/>
-        <w:numPr>
-          <w:ilvl w:val="0"/>
-          <w:numId w:val="5"/>
-        </w:numPr>
-        <w:rPr>
-          <w:sz w:val="18"/>
-          <w:szCs w:val="18"/>
-          <w:lang w:val="en-GB"/>
-        </w:rPr>
-      </w:pPr>
-      <w:r>
-        <w:rPr>
-          <w:sz w:val="18"/>
-          <w:szCs w:val="18"/>
-          <w:lang w:val="en-GB"/>
-        </w:rPr>
-        <w:t>SI-203-NL-Werkwijze Service Informatiebladen</w:t>
-      </w:r>
-    </w:p>
-    <w:p>
-      <w:pPr>
-        <w:pStyle w:val="ListParagraph"/>
-        <w:numPr>
-          <w:ilvl w:val="0"/>
-          <w:numId w:val="5"/>
-        </w:numPr>
-        <w:rPr/>
-      </w:pPr>
-      <w:r>
-        <w:rPr>
-          <w:sz w:val="18"/>
-          <w:szCs w:val="18"/>
-          <w:lang w:val="en-GB"/>
-        </w:rPr>
-        <w:t>SI-237-NL-Calamiteiten melding</w:t>
-      </w:r>
-    </w:p>
-    <w:p>
-      <w:pPr>
-        <w:pStyle w:val="ListParagraph"/>
-        <w:numPr>
-          <w:ilvl w:val="0"/>
-          <w:numId w:val="5"/>
-        </w:numPr>
-        <w:rPr>
-          <w:sz w:val="18"/>
-          <w:szCs w:val="18"/>
-        </w:rPr>
-      </w:pPr>
-      <w:r>
-        <w:rPr>
-          <w:sz w:val="18"/>
-          <w:szCs w:val="18"/>
-        </w:rPr>
-        <w:t>SI-287-NL-Werkwijze Nasco software wijzigingen</w:t>
       </w:r>
     </w:p>
     <w:p>
@@ -625,7 +486,7 @@
         <w:pStyle w:val="Heading1"/>
         <w:numPr>
           <w:ilvl w:val="0"/>
-          <w:numId w:val="16"/>
+          <w:numId w:val="12"/>
         </w:numPr>
         <w:spacing w:before="0" w:after="0"/>
         <w:rPr>
@@ -715,10 +576,48 @@
     </w:p>
     <w:p>
       <w:pPr>
+        <w:pStyle w:val="Normal"/>
+        <w:rPr>
+          <w:b/>
+          <w:bCs/>
+        </w:rPr>
+      </w:pPr>
+      <w:r>
+        <w:rPr>
+          <w:b/>
+          <w:bCs/>
+        </w:rPr>
+      </w:r>
+    </w:p>
+    <w:p>
+      <w:pPr>
+        <w:pStyle w:val="Normal"/>
+        <w:rPr>
+          <w:b/>
+          <w:bCs/>
+        </w:rPr>
+      </w:pPr>
+      <w:r>
+        <w:rPr>
+          <w:b/>
+          <w:bCs/>
+        </w:rPr>
+        <w:t>Probleem:</w:t>
+      </w:r>
+      <w:r>
+        <w:rPr>
+          <w:b w:val="false"/>
+          <w:bCs w:val="false"/>
+        </w:rPr>
+        <w:t xml:space="preserve"> The machine stops during production after approximately 20 minutes. Error code E204 appears on the control panel. After restarting, the machine works temporarily, but the problem returns.</w:t>
+      </w:r>
+    </w:p>
+    <w:p>
+      <w:pPr>
         <w:pStyle w:val="Heading1"/>
         <w:numPr>
           <w:ilvl w:val="0"/>
-          <w:numId w:val="17"/>
+          <w:numId w:val="13"/>
         </w:numPr>
         <w:rPr>
           <w:lang w:val="en-GB"/>
@@ -760,31 +659,6 @@
           <w:b/>
           <w:lang w:val="en-GB" w:eastAsia="en-US"/>
         </w:rPr>
-        <w:t xml:space="preserve">FAT: </w:t>
-      </w:r>
-      <w:r>
-        <w:rPr>
-          <w:b w:val="false"/>
-          <w:bCs w:val="false"/>
-          <w:lang w:val="en-GB" w:eastAsia="en-US"/>
-        </w:rPr>
-        <w:t>FAT-2024-00158</w:t>
-      </w:r>
-    </w:p>
-    <w:p>
-      <w:pPr>
-        <w:pStyle w:val="Normal"/>
-        <w:rPr>
-          <w:b w:val="false"/>
-          <w:bCs w:val="false"/>
-          <w:lang w:val="en-GB" w:eastAsia="en-US"/>
-        </w:rPr>
-      </w:pPr>
-      <w:r>
-        <w:rPr>
-          <w:b/>
-          <w:lang w:val="en-GB" w:eastAsia="en-US"/>
-        </w:rPr>
         <w:t xml:space="preserve">Installatie: </w:t>
       </w:r>
       <w:r>
@@ -860,7 +734,7 @@
         <w:pStyle w:val="Heading3"/>
         <w:numPr>
           <w:ilvl w:val="2"/>
-          <w:numId w:val="18"/>
+          <w:numId w:val="14"/>
         </w:numPr>
         <w:rPr>
           <w:lang w:val="en-GB"/>
@@ -926,7 +800,7 @@
         <w:pStyle w:val="Heading3"/>
         <w:numPr>
           <w:ilvl w:val="2"/>
-          <w:numId w:val="19"/>
+          <w:numId w:val="15"/>
         </w:numPr>
         <w:rPr>
           <w:lang w:val="en-GB"/>
@@ -973,7 +847,7 @@
         <w:pStyle w:val="Heading3"/>
         <w:numPr>
           <w:ilvl w:val="2"/>
-          <w:numId w:val="20"/>
+          <w:numId w:val="16"/>
         </w:numPr>
         <w:rPr>
           <w:lang w:val="en-GB"/>
@@ -1017,7 +891,7 @@
         <w:pStyle w:val="Heading3"/>
         <w:numPr>
           <w:ilvl w:val="2"/>
-          <w:numId w:val="21"/>
+          <w:numId w:val="17"/>
         </w:numPr>
         <w:rPr>
           <w:lang w:val="en-GB"/>
@@ -1139,22 +1013,15 @@
           <w:bCs w:val="false"/>
         </w:rPr>
       </w:pPr>
-      <w:bookmarkStart w:id="9" w:name="_Hlk101449548"/>
-      <w:bookmarkEnd w:id="9"/>
-      <w:r>
-        <w:rPr>
-          <w:b/>
-          <w:bCs/>
-        </w:rPr>
-        <w:tab/>
-      </w:r>
       <w:r>
         <w:rPr>
           <w:b w:val="false"/>
           <w:bCs w:val="false"/>
         </w:rPr>
-        <w:t>The customer was advised to keep the machine out of operation for the time being and not perform further resets. An engineer will first review the error history and then determine whether remote support is sufficient or whether an on-site service technician is required.</w:t>
       </w:r>
+      <w:bookmarkStart w:id="9" w:name="_Hlk101449548"/>
+      <w:bookmarkStart w:id="10" w:name="_Hlk101449548"/>
+      <w:bookmarkEnd w:id="10"/>
     </w:p>
     <w:p>
       <w:pPr>
@@ -1182,646 +1049,6 @@
       <w:r>
         <w:rPr/>
         <w:t xml:space="preserve"> </w:t>
-      </w:r>
-    </w:p>
-    <w:p>
-      <w:pPr>
-        <w:pStyle w:val="Normal"/>
-        <w:rPr>
-          <w:rFonts w:ascii="Cambria" w:hAnsi="Cambria" w:cs="Times New Roman"/>
-          <w:b/>
-          <w:bCs/>
-          <w:color w:val="4F81BD"/>
-          <w:sz w:val="32"/>
-          <w:szCs w:val="28"/>
-          <w:lang w:eastAsia="en-US"/>
-        </w:rPr>
-      </w:pPr>
-      <w:r>
-        <w:rPr>
-          <w:rFonts w:cs="Times New Roman" w:ascii="Cambria" w:hAnsi="Cambria"/>
-          <w:b/>
-          <w:bCs/>
-          <w:color w:val="4F81BD"/>
-          <w:sz w:val="32"/>
-          <w:szCs w:val="28"/>
-          <w:lang w:eastAsia="en-US"/>
-        </w:rPr>
-      </w:r>
-      <w:r>
-        <w:br w:type="page"/>
-      </w:r>
-    </w:p>
-    <w:p>
-      <w:pPr>
-        <w:pStyle w:val="Heading1"/>
-        <w:numPr>
-          <w:ilvl w:val="0"/>
-          <w:numId w:val="22"/>
-        </w:numPr>
-        <w:spacing w:before="0" w:after="0"/>
-        <w:rPr/>
-      </w:pPr>
-      <w:bookmarkStart w:id="10" w:name="_Toc139032106"/>
-      <w:r>
-        <w:rPr/>
-        <w:t>Instructie vastleggen</w:t>
-      </w:r>
-      <w:bookmarkEnd w:id="10"/>
-    </w:p>
-    <w:p>
-      <w:pPr>
-        <w:pStyle w:val="Normal"/>
-        <w:rPr/>
-      </w:pPr>
-      <w:r>
-        <w:rPr/>
-      </w:r>
-    </w:p>
-    <w:p>
-      <w:pPr>
-        <w:pStyle w:val="Normal"/>
-        <w:rPr>
-          <w:b w:val="false"/>
-          <w:bCs w:val="false"/>
-        </w:rPr>
-      </w:pPr>
-      <w:r>
-        <w:rPr>
-          <w:b/>
-        </w:rPr>
-        <w:t xml:space="preserve">Mail aan: </w:t>
-      </w:r>
-      <w:r>
-        <w:rPr>
-          <w:b w:val="false"/>
-          <w:bCs w:val="false"/>
-        </w:rPr>
-        <w:t>service@example.com</w:t>
-      </w:r>
-    </w:p>
-    <w:p>
-      <w:pPr>
-        <w:pStyle w:val="Normal"/>
-        <w:rPr/>
-      </w:pPr>
-      <w:r>
-        <w:rPr/>
-        <w:t xml:space="preserve">Graag concept instructie </w:t>
-      </w:r>
-      <w:r>
-        <w:rPr>
-          <w:highlight w:val="yellow"/>
-        </w:rPr>
-        <w:t>opstarten / aanpassen: SI......</w:t>
-      </w:r>
-    </w:p>
-    <w:p>
-      <w:pPr>
-        <w:pStyle w:val="Normal"/>
-        <w:rPr/>
-      </w:pPr>
-      <w:r>
-        <w:rPr/>
-        <w:t>Inhoud kun je halen uit MS-</w:t>
-      </w:r>
-      <w:r>
-        <w:rPr>
-          <w:highlight w:val="yellow"/>
-        </w:rPr>
-        <w:t>....</w:t>
-      </w:r>
-      <w:r>
-        <w:rPr/>
-        <w:t xml:space="preserve"> hoofdstuk 4.1</w:t>
-      </w:r>
-    </w:p>
-    <w:p>
-      <w:pPr>
-        <w:pStyle w:val="Normal"/>
-        <w:rPr>
-          <w:rFonts w:cs="Arial"/>
-          <w:szCs w:val="20"/>
-          <w:lang w:val="en-US"/>
-        </w:rPr>
-      </w:pPr>
-      <w:r>
-        <w:rPr>
-          <w:rFonts w:cs="Arial"/>
-          <w:szCs w:val="20"/>
-          <w:lang w:val="en-US"/>
-        </w:rPr>
-        <w:t xml:space="preserve">SI type: </w:t>
-      </w:r>
-      <w:r>
-        <w:rPr>
-          <w:rFonts w:cs="Arial"/>
-          <w:szCs w:val="20"/>
-          <w:highlight w:val="yellow"/>
-          <w:lang w:val="en-US"/>
-        </w:rPr>
-        <w:t>Servicedesk / Allround Service Engineer</w:t>
-      </w:r>
-    </w:p>
-    <w:p>
-      <w:pPr>
-        <w:pStyle w:val="Normal"/>
-        <w:rPr>
-          <w:lang w:val="en-GB"/>
-        </w:rPr>
-      </w:pPr>
-      <w:r>
-        <w:rPr>
-          <w:lang w:val="en-GB"/>
-        </w:rPr>
-      </w:r>
-    </w:p>
-    <w:p>
-      <w:pPr>
-        <w:pStyle w:val="Normal"/>
-        <w:rPr>
-          <w:lang w:val="en-GB"/>
-        </w:rPr>
-      </w:pPr>
-      <w:r>
-        <w:rPr>
-          <w:lang w:val="en-GB"/>
-        </w:rPr>
-      </w:r>
-    </w:p>
-    <w:p>
-      <w:pPr>
-        <w:pStyle w:val="Heading2"/>
-        <w:numPr>
-          <w:ilvl w:val="1"/>
-          <w:numId w:val="23"/>
-        </w:numPr>
-        <w:rPr/>
-      </w:pPr>
-      <w:bookmarkStart w:id="11" w:name="_Toc139032107"/>
-      <w:r>
-        <w:rPr/>
-        <w:t>SI-...</w:t>
-      </w:r>
-      <w:bookmarkEnd w:id="11"/>
-    </w:p>
-    <w:p>
-      <w:pPr>
-        <w:pStyle w:val="Normal"/>
-        <w:rPr/>
-      </w:pPr>
-      <w:r>
-        <w:rPr/>
-      </w:r>
-    </w:p>
-    <w:p>
-      <w:pPr>
-        <w:pStyle w:val="Normal"/>
-        <w:rPr>
-          <w:b/>
-          <w:color w:val="FF0000"/>
-        </w:rPr>
-      </w:pPr>
-      <w:r>
-        <w:rPr>
-          <w:b/>
-          <w:color w:val="FF0000"/>
-        </w:rPr>
-        <w:t>Concept:</w:t>
-      </w:r>
-    </w:p>
-    <w:p>
-      <w:pPr>
-        <w:pStyle w:val="Normal"/>
-        <w:rPr>
-          <w:color w:val="FF0000"/>
-        </w:rPr>
-      </w:pPr>
-      <w:r>
-        <w:rPr>
-          <w:color w:val="FF0000"/>
-        </w:rPr>
-      </w:r>
-    </w:p>
-    <w:p>
-      <w:pPr>
-        <w:pStyle w:val="Normal"/>
-        <w:rPr>
-          <w:color w:val="FF0000"/>
-        </w:rPr>
-      </w:pPr>
-      <w:r>
-        <w:rPr>
-          <w:color w:val="FF0000"/>
-        </w:rPr>
-      </w:r>
-    </w:p>
-    <w:p>
-      <w:pPr>
-        <w:pStyle w:val="Normal"/>
-        <w:rPr>
-          <w:b/>
-        </w:rPr>
-      </w:pPr>
-      <w:r>
-        <w:rPr>
-          <w:b/>
-        </w:rPr>
-        <w:t>Problem:</w:t>
-      </w:r>
-    </w:p>
-    <w:p>
-      <w:pPr>
-        <w:pStyle w:val="Normal"/>
-        <w:rPr/>
-      </w:pPr>
-      <w:r>
-        <w:rPr/>
-      </w:r>
-    </w:p>
-    <w:p>
-      <w:pPr>
-        <w:pStyle w:val="Normal"/>
-        <w:rPr>
-          <w:b/>
-        </w:rPr>
-      </w:pPr>
-      <w:r>
-        <w:rPr>
-          <w:b/>
-        </w:rPr>
-      </w:r>
-    </w:p>
-    <w:p>
-      <w:pPr>
-        <w:pStyle w:val="Normal"/>
-        <w:rPr>
-          <w:b/>
-        </w:rPr>
-      </w:pPr>
-      <w:r>
-        <w:rPr>
-          <w:b/>
-        </w:rPr>
-        <w:t>Information:</w:t>
-      </w:r>
-    </w:p>
-    <w:p>
-      <w:pPr>
-        <w:pStyle w:val="Normal"/>
-        <w:rPr>
-          <w:highlight w:val="yellow"/>
-          <w:lang w:val="en-GB"/>
-        </w:rPr>
-      </w:pPr>
-      <w:r>
-        <w:rPr>
-          <w:highlight w:val="yellow"/>
-          <w:lang w:val="en-GB"/>
-        </w:rPr>
-        <w:t>We need the following information to be able to give good advice:</w:t>
-      </w:r>
-    </w:p>
-    <w:p>
-      <w:pPr>
-        <w:pStyle w:val="ListParagraph"/>
-        <w:numPr>
-          <w:ilvl w:val="0"/>
-          <w:numId w:val="4"/>
-        </w:numPr>
-        <w:rPr>
-          <w:highlight w:val="yellow"/>
-        </w:rPr>
-      </w:pPr>
-      <w:r>
-        <w:rPr>
-          <w:highlight w:val="yellow"/>
-        </w:rPr>
-        <w:t>Machine number?</w:t>
-      </w:r>
-    </w:p>
-    <w:p>
-      <w:pPr>
-        <w:pStyle w:val="ListParagraph"/>
-        <w:numPr>
-          <w:ilvl w:val="0"/>
-          <w:numId w:val="4"/>
-        </w:numPr>
-        <w:rPr>
-          <w:highlight w:val="yellow"/>
-          <w:lang w:val="en-GB"/>
-        </w:rPr>
-      </w:pPr>
-      <w:r>
-        <w:rPr>
-          <w:highlight w:val="yellow"/>
-          <w:lang w:val="en-GB"/>
-        </w:rPr>
-        <w:t>What is the problem (photo/video)?</w:t>
-      </w:r>
-    </w:p>
-    <w:p>
-      <w:pPr>
-        <w:pStyle w:val="ListParagraph"/>
-        <w:numPr>
-          <w:ilvl w:val="0"/>
-          <w:numId w:val="4"/>
-        </w:numPr>
-        <w:rPr>
-          <w:highlight w:val="yellow"/>
-          <w:lang w:val="en-GB"/>
-        </w:rPr>
-      </w:pPr>
-      <w:r>
-        <w:rPr>
-          <w:highlight w:val="yellow"/>
-          <w:lang w:val="en-GB"/>
-        </w:rPr>
-        <w:t>When did the problem started?</w:t>
-      </w:r>
-    </w:p>
-    <w:p>
-      <w:pPr>
-        <w:pStyle w:val="ListParagraph"/>
-        <w:numPr>
-          <w:ilvl w:val="0"/>
-          <w:numId w:val="4"/>
-        </w:numPr>
-        <w:rPr>
-          <w:highlight w:val="yellow"/>
-          <w:lang w:val="en-GB"/>
-        </w:rPr>
-      </w:pPr>
-      <w:r>
-        <w:rPr>
-          <w:highlight w:val="yellow"/>
-          <w:lang w:val="en-GB"/>
-        </w:rPr>
-        <w:t>What changed (mechanical / electrical / software / product / film) before the problem started?</w:t>
-      </w:r>
-    </w:p>
-    <w:p>
-      <w:pPr>
-        <w:pStyle w:val="ListParagraph"/>
-        <w:numPr>
-          <w:ilvl w:val="0"/>
-          <w:numId w:val="4"/>
-        </w:numPr>
-        <w:rPr>
-          <w:highlight w:val="yellow"/>
-        </w:rPr>
-      </w:pPr>
-      <w:r>
-        <w:rPr>
-          <w:highlight w:val="yellow"/>
-        </w:rPr>
-        <w:t>Problem with all indexes?</w:t>
-      </w:r>
-    </w:p>
-    <w:p>
-      <w:pPr>
-        <w:pStyle w:val="ListParagraph"/>
-        <w:numPr>
-          <w:ilvl w:val="0"/>
-          <w:numId w:val="4"/>
-        </w:numPr>
-        <w:rPr>
-          <w:highlight w:val="yellow"/>
-          <w:lang w:val="en-GB"/>
-        </w:rPr>
-      </w:pPr>
-      <w:r>
-        <w:rPr>
-          <w:highlight w:val="yellow"/>
-          <w:lang w:val="en-GB"/>
-        </w:rPr>
-        <w:t>Problem at specific moments (every stroke, start-up, ...)?</w:t>
-      </w:r>
-    </w:p>
-    <w:p>
-      <w:pPr>
-        <w:pStyle w:val="ListParagraph"/>
-        <w:numPr>
-          <w:ilvl w:val="0"/>
-          <w:numId w:val="4"/>
-        </w:numPr>
-        <w:rPr>
-          <w:highlight w:val="yellow"/>
-          <w:lang w:val="en-GB"/>
-        </w:rPr>
-      </w:pPr>
-      <w:r>
-        <w:rPr>
-          <w:highlight w:val="yellow"/>
-          <w:lang w:val="en-GB"/>
-        </w:rPr>
-        <w:t>Photo’s of the HMI settings?</w:t>
-      </w:r>
-    </w:p>
-    <w:p>
-      <w:pPr>
-        <w:pStyle w:val="ListParagraph"/>
-        <w:numPr>
-          <w:ilvl w:val="0"/>
-          <w:numId w:val="4"/>
-        </w:numPr>
-        <w:rPr>
-          <w:highlight w:val="yellow"/>
-          <w:lang w:val="en-GB"/>
-        </w:rPr>
-      </w:pPr>
-      <w:r>
-        <w:rPr>
-          <w:highlight w:val="yellow"/>
-          <w:lang w:val="en-GB"/>
-        </w:rPr>
-        <w:t>Photo of stroke counter (menu Miscellaneous)?</w:t>
-      </w:r>
-    </w:p>
-    <w:p>
-      <w:pPr>
-        <w:pStyle w:val="Normal"/>
-        <w:rPr>
-          <w:lang w:val="en-GB"/>
-        </w:rPr>
-      </w:pPr>
-      <w:r>
-        <w:rPr>
-          <w:lang w:val="en-GB"/>
-        </w:rPr>
-      </w:r>
-    </w:p>
-    <w:p>
-      <w:pPr>
-        <w:pStyle w:val="Normal"/>
-        <w:rPr>
-          <w:highlight w:val="yellow"/>
-          <w:lang w:val="en-GB"/>
-        </w:rPr>
-      </w:pPr>
-      <w:r>
-        <w:rPr>
-          <w:highlight w:val="yellow"/>
-          <w:lang w:val="en-GB"/>
-        </w:rPr>
-        <w:t>Please send a video of the problem, so we can hear and see whatet is happening during the process.</w:t>
-      </w:r>
-    </w:p>
-    <w:p>
-      <w:pPr>
-        <w:pStyle w:val="Normal"/>
-        <w:rPr>
-          <w:highlight w:val="yellow"/>
-          <w:lang w:val="en-GB"/>
-        </w:rPr>
-      </w:pPr>
-      <w:r>
-        <w:rPr>
-          <w:highlight w:val="yellow"/>
-          <w:lang w:val="en-GB"/>
-        </w:rPr>
-      </w:r>
-    </w:p>
-    <w:p>
-      <w:pPr>
-        <w:pStyle w:val="Normal"/>
-        <w:rPr>
-          <w:highlight w:val="yellow"/>
-          <w:lang w:val="en-GB"/>
-        </w:rPr>
-      </w:pPr>
-      <w:r>
-        <w:rPr>
-          <w:highlight w:val="yellow"/>
-          <w:lang w:val="en-GB"/>
-        </w:rPr>
-        <w:t>Please send a video of the following HMI screens, so we can see what is happening during the process:</w:t>
-      </w:r>
-    </w:p>
-    <w:p>
-      <w:pPr>
-        <w:pStyle w:val="ListParagraph"/>
-        <w:numPr>
-          <w:ilvl w:val="0"/>
-          <w:numId w:val="4"/>
-        </w:numPr>
-        <w:rPr>
-          <w:highlight w:val="yellow"/>
-          <w:lang w:val="en-GB"/>
-        </w:rPr>
-      </w:pPr>
-      <w:r>
-        <w:rPr>
-          <w:highlight w:val="yellow"/>
-        </w:rPr>
-        <w:t>go to menu Main &gt; ......</w:t>
-      </w:r>
-    </w:p>
-    <w:p>
-      <w:pPr>
-        <w:pStyle w:val="Normal"/>
-        <w:rPr>
-          <w:lang w:val="en-GB"/>
-        </w:rPr>
-      </w:pPr>
-      <w:r>
-        <w:rPr>
-          <w:lang w:val="en-GB"/>
-        </w:rPr>
-      </w:r>
-    </w:p>
-    <w:p>
-      <w:pPr>
-        <w:pStyle w:val="Normal"/>
-        <w:rPr/>
-      </w:pPr>
-      <w:r>
-        <w:rPr/>
-      </w:r>
-    </w:p>
-    <w:p>
-      <w:pPr>
-        <w:pStyle w:val="Normal"/>
-        <w:rPr/>
-      </w:pPr>
-      <w:r>
-        <w:rPr/>
-      </w:r>
-    </w:p>
-    <w:p>
-      <w:pPr>
-        <w:pStyle w:val="Normal"/>
-        <w:rPr>
-          <w:b/>
-        </w:rPr>
-      </w:pPr>
-      <w:r>
-        <w:rPr>
-          <w:b/>
-        </w:rPr>
-        <w:t>Causes:</w:t>
-      </w:r>
-    </w:p>
-    <w:p>
-      <w:pPr>
-        <w:pStyle w:val="Normal"/>
-        <w:rPr/>
-      </w:pPr>
-      <w:r>
-        <w:rPr/>
-      </w:r>
-    </w:p>
-    <w:p>
-      <w:pPr>
-        <w:pStyle w:val="Normal"/>
-        <w:rPr/>
-      </w:pPr>
-      <w:r>
-        <w:rPr/>
-      </w:r>
-    </w:p>
-    <w:p>
-      <w:pPr>
-        <w:pStyle w:val="Normal"/>
-        <w:rPr>
-          <w:b/>
-        </w:rPr>
-      </w:pPr>
-      <w:r>
-        <w:rPr>
-          <w:b/>
-        </w:rPr>
-        <w:t>Problem solving:</w:t>
-      </w:r>
-    </w:p>
-    <w:p>
-      <w:pPr>
-        <w:pStyle w:val="Normal"/>
-        <w:rPr/>
-      </w:pPr>
-      <w:r>
-        <w:rPr/>
-      </w:r>
-    </w:p>
-    <w:p>
-      <w:pPr>
-        <w:pStyle w:val="Normal"/>
-        <w:rPr/>
-      </w:pPr>
-      <w:r>
-        <w:rPr/>
-      </w:r>
-      <w:bookmarkStart w:id="12" w:name="_Hlk101449548_Copy_1"/>
-      <w:bookmarkStart w:id="13" w:name="_Hlk101449548_Copy_1"/>
-      <w:bookmarkEnd w:id="13"/>
-    </w:p>
-    <w:p>
-      <w:pPr>
-        <w:pStyle w:val="Normal"/>
-        <w:rPr/>
-      </w:pPr>
-      <w:r>
-        <w:rPr/>
       </w:r>
     </w:p>
     <w:p>
@@ -1878,7 +1105,7 @@
       <w:footerReference w:type="first" r:id="rId7"/>
       <w:type w:val="nextPage"/>
       <w:pgSz w:w="11906" w:h="16838"/>
-      <w:pgMar w:left="1134" w:right="1134" w:gutter="0" w:header="709" w:top="1979" w:footer="1134" w:bottom="1418"/>
+      <w:pgMar w:left="1134" w:right="1134" w:gutter="0" w:header="709" w:top="2351" w:footer="1134" w:bottom="1418"/>
       <w:pgNumType w:fmt="decimal"/>
       <w:formProt w:val="false"/>
       <w:textDirection w:val="lrTb"/>
@@ -1920,7 +1147,7 @@
       <mc:AlternateContent>
         <mc:Choice Requires="wps">
           <w:drawing>
-            <wp:anchor behindDoc="1" distT="12065" distB="10795" distL="11430" distR="11430" simplePos="0" locked="0" layoutInCell="1" allowOverlap="1" relativeHeight="27" wp14:anchorId="43F5D922">
+            <wp:anchor behindDoc="1" distT="12065" distB="10795" distL="11430" distR="11430" simplePos="0" locked="0" layoutInCell="1" allowOverlap="1" relativeHeight="31" wp14:anchorId="43F5D922">
               <wp:simplePos x="0" y="0"/>
               <wp:positionH relativeFrom="column">
                 <wp:posOffset>-342900</wp:posOffset>
@@ -2416,7 +1643,7 @@
       <mc:AlternateContent>
         <mc:Choice Requires="wps">
           <w:drawing>
-            <wp:anchor behindDoc="1" distT="12065" distB="10795" distL="11430" distR="11430" simplePos="0" locked="0" layoutInCell="1" allowOverlap="1" relativeHeight="49" wp14:anchorId="1106C530">
+            <wp:anchor behindDoc="1" distT="12065" distB="10795" distL="11430" distR="11430" simplePos="0" locked="0" layoutInCell="1" allowOverlap="1" relativeHeight="45" wp14:anchorId="1106C530">
               <wp:simplePos x="0" y="0"/>
               <wp:positionH relativeFrom="column">
                 <wp:posOffset>3543300</wp:posOffset>
@@ -2644,7 +1871,7 @@
       <mc:AlternateContent>
         <mc:Choice Requires="wps">
           <w:drawing>
-            <wp:anchor behindDoc="1" distT="12065" distB="10795" distL="11430" distR="11430" simplePos="0" locked="0" layoutInCell="1" allowOverlap="1" relativeHeight="60" wp14:anchorId="1E80C8F5">
+            <wp:anchor behindDoc="1" distT="12065" distB="10795" distL="11430" distR="11430" simplePos="0" locked="0" layoutInCell="1" allowOverlap="1" relativeHeight="52" wp14:anchorId="1E80C8F5">
               <wp:simplePos x="0" y="0"/>
               <wp:positionH relativeFrom="column">
                 <wp:posOffset>5372100</wp:posOffset>
@@ -2764,7 +1991,7 @@
                               <w:rFonts w:cs="Arial"/>
                               <w:color w:val="000000"/>
                             </w:rPr>
-                            <w:t>5</w:t>
+                            <w:t>3</w:t>
                           </w:r>
                           <w:r>
                             <w:rPr>
@@ -2827,7 +2054,7 @@
                               <w:rFonts w:cs="Arial"/>
                               <w:color w:val="000000"/>
                             </w:rPr>
-                            <w:t>5</w:t>
+                            <w:t>3</w:t>
                           </w:r>
                           <w:r>
                             <w:rPr>
@@ -2935,7 +2162,7 @@
                         <w:rFonts w:cs="Arial"/>
                         <w:color w:val="000000"/>
                       </w:rPr>
-                      <w:t>5</w:t>
+                      <w:t>3</w:t>
                     </w:r>
                     <w:r>
                       <w:rPr>
@@ -2998,7 +2225,7 @@
                         <w:rFonts w:cs="Arial"/>
                         <w:color w:val="000000"/>
                       </w:rPr>
-                      <w:t>5</w:t>
+                      <w:t>3</w:t>
                     </w:r>
                     <w:r>
                       <w:rPr>
@@ -3055,7 +2282,7 @@
       <mc:AlternateContent>
         <mc:Choice Requires="wps">
           <w:drawing>
-            <wp:anchor behindDoc="1" distT="12065" distB="10795" distL="11430" distR="11430" simplePos="0" locked="0" layoutInCell="1" allowOverlap="1" relativeHeight="27" wp14:anchorId="43F5D922">
+            <wp:anchor behindDoc="1" distT="12065" distB="10795" distL="11430" distR="11430" simplePos="0" locked="0" layoutInCell="1" allowOverlap="1" relativeHeight="31" wp14:anchorId="43F5D922">
               <wp:simplePos x="0" y="0"/>
               <wp:positionH relativeFrom="column">
                 <wp:posOffset>-342900</wp:posOffset>
@@ -3551,7 +2778,7 @@
       <mc:AlternateContent>
         <mc:Choice Requires="wps">
           <w:drawing>
-            <wp:anchor behindDoc="1" distT="12065" distB="10795" distL="11430" distR="11430" simplePos="0" locked="0" layoutInCell="1" allowOverlap="1" relativeHeight="49" wp14:anchorId="1106C530">
+            <wp:anchor behindDoc="1" distT="12065" distB="10795" distL="11430" distR="11430" simplePos="0" locked="0" layoutInCell="1" allowOverlap="1" relativeHeight="45" wp14:anchorId="1106C530">
               <wp:simplePos x="0" y="0"/>
               <wp:positionH relativeFrom="column">
                 <wp:posOffset>3543300</wp:posOffset>
@@ -3779,7 +3006,7 @@
       <mc:AlternateContent>
         <mc:Choice Requires="wps">
           <w:drawing>
-            <wp:anchor behindDoc="1" distT="12065" distB="10795" distL="11430" distR="11430" simplePos="0" locked="0" layoutInCell="1" allowOverlap="1" relativeHeight="60" wp14:anchorId="1E80C8F5">
+            <wp:anchor behindDoc="1" distT="12065" distB="10795" distL="11430" distR="11430" simplePos="0" locked="0" layoutInCell="1" allowOverlap="1" relativeHeight="52" wp14:anchorId="1E80C8F5">
               <wp:simplePos x="0" y="0"/>
               <wp:positionH relativeFrom="column">
                 <wp:posOffset>5372100</wp:posOffset>
@@ -3899,7 +3126,7 @@
                               <w:rFonts w:cs="Arial"/>
                               <w:color w:val="000000"/>
                             </w:rPr>
-                            <w:t>5</w:t>
+                            <w:t>3</w:t>
                           </w:r>
                           <w:r>
                             <w:rPr>
@@ -3962,7 +3189,7 @@
                               <w:rFonts w:cs="Arial"/>
                               <w:color w:val="000000"/>
                             </w:rPr>
-                            <w:t>5</w:t>
+                            <w:t>3</w:t>
                           </w:r>
                           <w:r>
                             <w:rPr>
@@ -4070,7 +3297,7 @@
                         <w:rFonts w:cs="Arial"/>
                         <w:color w:val="000000"/>
                       </w:rPr>
-                      <w:t>5</w:t>
+                      <w:t>3</w:t>
                     </w:r>
                     <w:r>
                       <w:rPr>
@@ -4133,7 +3360,7 @@
                         <w:rFonts w:cs="Arial"/>
                         <w:color w:val="000000"/>
                       </w:rPr>
-                      <w:t>5</w:t>
+                      <w:t>3</w:t>
                     </w:r>
                     <w:r>
                       <w:rPr>
@@ -4203,7 +3430,7 @@
       <mc:AlternateContent>
         <mc:Choice Requires="wps">
           <w:drawing>
-            <wp:anchor behindDoc="1" distT="11430" distB="11430" distL="11430" distR="11430" simplePos="0" locked="0" layoutInCell="1" allowOverlap="1" relativeHeight="6" wp14:anchorId="45E6EC9F">
+            <wp:anchor behindDoc="1" distT="11430" distB="11430" distL="11430" distR="11430" simplePos="0" locked="0" layoutInCell="1" allowOverlap="1" relativeHeight="4" wp14:anchorId="45E6EC9F">
               <wp:simplePos x="0" y="0"/>
               <wp:positionH relativeFrom="column">
                 <wp:posOffset>-342900</wp:posOffset>
@@ -4211,7 +3438,7 @@
               <wp:positionV relativeFrom="paragraph">
                 <wp:posOffset>-57785</wp:posOffset>
               </wp:positionV>
-              <wp:extent cx="1828800" cy="685800"/>
+              <wp:extent cx="1828800" cy="1087755"/>
               <wp:effectExtent l="11430" t="11430" r="11430" b="11430"/>
               <wp:wrapNone/>
               <wp:docPr id="1" name="Rectangle 19"/>
@@ -4222,7 +3449,7 @@
                     <wps:spPr>
                       <a:xfrm>
                         <a:off x="0" y="0"/>
-                        <a:ext cx="1828800" cy="685800"/>
+                        <a:ext cx="1828800" cy="1087920"/>
                       </a:xfrm>
                       <a:prstGeom prst="rect">
                         <a:avLst/>
@@ -4250,7 +3477,7 @@
         </mc:Choice>
         <mc:Fallback>
           <w:pict>
-            <v:rect id="shape_0" ID="Rectangle 19" path="m0,0l-2147483645,0l-2147483645,-2147483646l0,-2147483646xe" stroked="t" o:allowincell="f" style="position:absolute;margin-left:-27pt;margin-top:-4.55pt;width:143.95pt;height:53.95pt;mso-wrap-style:none;v-text-anchor:middle" wp14:anchorId="45E6EC9F">
+            <v:rect id="shape_0" ID="Rectangle 19" path="m0,0l-2147483645,0l-2147483645,-2147483646l0,-2147483646xe" stroked="t" o:allowincell="f" style="position:absolute;margin-left:-27pt;margin-top:-4.55pt;width:143.95pt;height:85.6pt;mso-wrap-style:none;v-text-anchor:middle" wp14:anchorId="45E6EC9F">
               <v:fill o:detectmouseclick="t" on="false"/>
               <v:stroke color="black" weight="22320" joinstyle="miter" endcap="flat"/>
               <w10:wrap type="none"/>
@@ -4261,7 +3488,7 @@
       <mc:AlternateContent>
         <mc:Choice Requires="wps">
           <w:drawing>
-            <wp:anchor behindDoc="1" distT="11430" distB="11430" distL="11430" distR="11430" simplePos="0" locked="0" layoutInCell="1" allowOverlap="1" relativeHeight="12" wp14:anchorId="1BD92560">
+            <wp:anchor behindDoc="1" distT="11430" distB="11430" distL="11430" distR="11430" simplePos="0" locked="0" layoutInCell="1" allowOverlap="1" relativeHeight="8" wp14:anchorId="1BD92560">
               <wp:simplePos x="0" y="0"/>
               <wp:positionH relativeFrom="column">
                 <wp:posOffset>6515100</wp:posOffset>
@@ -4318,7 +3545,7 @@
       <mc:AlternateContent>
         <mc:Choice Requires="wps">
           <w:drawing>
-            <wp:anchor behindDoc="1" distT="11430" distB="11430" distL="11430" distR="11430" simplePos="0" locked="0" layoutInCell="1" allowOverlap="1" relativeHeight="18" wp14:anchorId="2D1772F5">
+            <wp:anchor behindDoc="1" distT="11430" distB="11430" distL="11430" distR="11430" simplePos="0" locked="0" layoutInCell="1" allowOverlap="1" relativeHeight="12" wp14:anchorId="2D1772F5">
               <wp:simplePos x="0" y="0"/>
               <wp:positionH relativeFrom="column">
                 <wp:posOffset>-342900</wp:posOffset>
@@ -4375,7 +3602,7 @@
       <mc:AlternateContent>
         <mc:Choice Requires="wps">
           <w:drawing>
-            <wp:anchor behindDoc="1" distT="0" distB="1270" distL="0" distR="0" simplePos="0" locked="0" layoutInCell="1" allowOverlap="1" relativeHeight="72" wp14:anchorId="5AA79684">
+            <wp:anchor behindDoc="1" distT="0" distB="1270" distL="0" distR="0" simplePos="0" locked="0" layoutInCell="1" allowOverlap="1" relativeHeight="18" wp14:anchorId="5AA79684">
               <wp:simplePos x="0" y="0"/>
               <wp:positionH relativeFrom="column">
                 <wp:posOffset>1828800</wp:posOffset>
@@ -4472,7 +3699,7 @@
       <mc:AlternateContent>
         <mc:Choice Requires="wps">
           <w:drawing>
-            <wp:anchor behindDoc="1" distT="11430" distB="11430" distL="11430" distR="11430" simplePos="0" locked="0" layoutInCell="1" allowOverlap="1" relativeHeight="83" wp14:anchorId="107AA7BE">
+            <wp:anchor behindDoc="1" distT="11430" distB="11430" distL="11430" distR="11430" simplePos="0" locked="0" layoutInCell="1" allowOverlap="1" relativeHeight="25" wp14:anchorId="107AA7BE">
               <wp:simplePos x="0" y="0"/>
               <wp:positionH relativeFrom="column">
                 <wp:posOffset>1485900</wp:posOffset>
@@ -4480,7 +3707,7 @@
               <wp:positionV relativeFrom="paragraph">
                 <wp:posOffset>-57785</wp:posOffset>
               </wp:positionV>
-              <wp:extent cx="4114800" cy="685800"/>
+              <wp:extent cx="4114800" cy="1087120"/>
               <wp:effectExtent l="11430" t="11430" r="11430" b="11430"/>
               <wp:wrapNone/>
               <wp:docPr id="5" name="Text Box 31"/>
@@ -4491,7 +3718,7 @@
                     <wps:spPr>
                       <a:xfrm>
                         <a:off x="0" y="0"/>
-                        <a:ext cx="4114800" cy="685800"/>
+                        <a:ext cx="4114800" cy="1087200"/>
                       </a:xfrm>
                       <a:prstGeom prst="rect">
                         <a:avLst/>
@@ -4545,9 +3772,34 @@
                           <w:r>
                             <w:rPr>
                               <w:rFonts w:cs="Arial"/>
-                              <w:color w:val="000000"/>
-                            </w:rPr>
-                            <w:t>202600123</w:t>
+                              <w:b/>
+                              <w:bCs/>
+                              <w:color w:val="000000"/>
+                            </w:rPr>
+                            <w:t xml:space="preserve">Meldingnummer: </w:t>
+                          </w:r>
+                          <w:r>
+                            <w:rPr>
+                              <w:rFonts w:cs="Arial"/>
+                              <w:color w:val="000000"/>
+                            </w:rPr>
+                            <w:t xml:space="preserve">202600123, </w:t>
+                          </w:r>
+                          <w:r>
+                            <w:rPr>
+                              <w:rFonts w:cs="Arial"/>
+                              <w:b/>
+                              <w:bCs/>
+                              <w:color w:val="000000"/>
+                            </w:rPr>
+                            <w:t xml:space="preserve">Machinenummer: </w:t>
+                          </w:r>
+                          <w:r>
+                            <w:rPr>
+                              <w:rFonts w:cs="Arial"/>
+                              <w:color w:val="000000"/>
+                            </w:rPr>
+                            <w:t>MCH-2024-00158</w:t>
                           </w:r>
                         </w:p>
                         <w:p>
@@ -4561,23 +3813,66 @@
                           <w:r>
                             <w:rPr>
                               <w:rFonts w:cs="Arial"/>
-                              <w:color w:val="000000"/>
-                            </w:rPr>
-                            <w:t xml:space="preserve">Distributor B.V., Joost Klein, Customer Ltd. </w:t>
-                          </w:r>
-                          <w:r>
-                            <w:rPr>
-                              <w:rFonts w:cs="Arial"/>
-                              <w:color w:val="000000"/>
-                            </w:rPr>
-                            <w:t>GMT</w:t>
-                          </w:r>
-                          <w:r>
-                            <w:rPr>
-                              <w:rFonts w:cs="Arial"/>
-                              <w:color w:val="000000"/>
-                            </w:rPr>
-                            <w:t>+1</w:t>
+                              <w:b/>
+                              <w:bCs/>
+                              <w:color w:val="000000"/>
+                            </w:rPr>
+                            <w:t xml:space="preserve">Distributeur: </w:t>
+                          </w:r>
+                          <w:r>
+                            <w:rPr>
+                              <w:rFonts w:cs="Arial"/>
+                              <w:color w:val="000000"/>
+                            </w:rPr>
+                            <w:t>Distributor B.V.,</w:t>
+                          </w:r>
+                          <w:r>
+                            <w:rPr>
+                              <w:rFonts w:cs="Arial"/>
+                              <w:b/>
+                              <w:bCs/>
+                              <w:color w:val="000000"/>
+                            </w:rPr>
+                            <w:t xml:space="preserve"> Monteur: </w:t>
+                          </w:r>
+                          <w:r>
+                            <w:rPr>
+                              <w:rFonts w:cs="Arial"/>
+                              <w:color w:val="000000"/>
+                            </w:rPr>
+                            <w:t xml:space="preserve">Joost Klein, </w:t>
+                          </w:r>
+                          <w:r>
+                            <w:rPr>
+                              <w:rFonts w:cs="Arial"/>
+                              <w:b/>
+                              <w:bCs/>
+                              <w:color w:val="000000"/>
+                            </w:rPr>
+                            <w:t xml:space="preserve">Klant: </w:t>
+                          </w:r>
+                          <w:r>
+                            <w:rPr>
+                              <w:rFonts w:cs="Arial"/>
+                              <w:color w:val="000000"/>
+                            </w:rPr>
+                            <w:t xml:space="preserve">Customer Ltd. </w:t>
+                          </w:r>
+                          <w:r>
+                            <w:rPr>
+                              <w:rFonts w:cs="Arial"/>
+                              <w:b/>
+                              <w:bCs/>
+                              <w:color w:val="000000"/>
+                            </w:rPr>
+                            <w:t xml:space="preserve">Tijdverschil: </w:t>
+                          </w:r>
+                          <w:r>
+                            <w:rPr>
+                              <w:rFonts w:cs="Arial"/>
+                              <w:color w:val="000000"/>
+                            </w:rPr>
+                            <w:t>GMT+1</w:t>
                           </w:r>
                         </w:p>
                       </w:txbxContent>
@@ -4593,7 +3888,7 @@
         </mc:Choice>
         <mc:Fallback>
           <w:pict>
-            <v:rect id="shape_0" ID="Text Box 31" path="m0,0l-2147483645,0l-2147483645,-2147483646l0,-2147483646xe" fillcolor="white" stroked="t" o:allowincell="f" style="position:absolute;margin-left:117pt;margin-top:-4.55pt;width:323.95pt;height:53.95pt;mso-wrap-style:square;v-text-anchor:middle" wp14:anchorId="107AA7BE">
+            <v:rect id="shape_0" ID="Text Box 31" path="m0,0l-2147483645,0l-2147483645,-2147483646l0,-2147483646xe" fillcolor="white" stroked="t" o:allowincell="f" style="position:absolute;margin-left:117pt;margin-top:-4.55pt;width:323.95pt;height:85.55pt;mso-wrap-style:square;v-text-anchor:middle" wp14:anchorId="107AA7BE">
               <v:fill o:detectmouseclick="t" type="solid" color2="black"/>
               <v:stroke color="black" weight="22320" joinstyle="miter" endcap="flat"/>
               <v:textbox>
@@ -4629,9 +3924,34 @@
                     <w:r>
                       <w:rPr>
                         <w:rFonts w:cs="Arial"/>
-                        <w:color w:val="000000"/>
-                      </w:rPr>
-                      <w:t>202600123</w:t>
+                        <w:b/>
+                        <w:bCs/>
+                        <w:color w:val="000000"/>
+                      </w:rPr>
+                      <w:t xml:space="preserve">Meldingnummer: </w:t>
+                    </w:r>
+                    <w:r>
+                      <w:rPr>
+                        <w:rFonts w:cs="Arial"/>
+                        <w:color w:val="000000"/>
+                      </w:rPr>
+                      <w:t xml:space="preserve">202600123, </w:t>
+                    </w:r>
+                    <w:r>
+                      <w:rPr>
+                        <w:rFonts w:cs="Arial"/>
+                        <w:b/>
+                        <w:bCs/>
+                        <w:color w:val="000000"/>
+                      </w:rPr>
+                      <w:t xml:space="preserve">Machinenummer: </w:t>
+                    </w:r>
+                    <w:r>
+                      <w:rPr>
+                        <w:rFonts w:cs="Arial"/>
+                        <w:color w:val="000000"/>
+                      </w:rPr>
+                      <w:t>MCH-2024-00158</w:t>
                     </w:r>
                   </w:p>
                   <w:p>
@@ -4645,23 +3965,66 @@
                     <w:r>
                       <w:rPr>
                         <w:rFonts w:cs="Arial"/>
-                        <w:color w:val="000000"/>
-                      </w:rPr>
-                      <w:t xml:space="preserve">Distributor B.V., Joost Klein, Customer Ltd. </w:t>
-                    </w:r>
-                    <w:r>
-                      <w:rPr>
-                        <w:rFonts w:cs="Arial"/>
-                        <w:color w:val="000000"/>
-                      </w:rPr>
-                      <w:t>GMT</w:t>
-                    </w:r>
-                    <w:r>
-                      <w:rPr>
-                        <w:rFonts w:cs="Arial"/>
-                        <w:color w:val="000000"/>
-                      </w:rPr>
-                      <w:t>+1</w:t>
+                        <w:b/>
+                        <w:bCs/>
+                        <w:color w:val="000000"/>
+                      </w:rPr>
+                      <w:t xml:space="preserve">Distributeur: </w:t>
+                    </w:r>
+                    <w:r>
+                      <w:rPr>
+                        <w:rFonts w:cs="Arial"/>
+                        <w:color w:val="000000"/>
+                      </w:rPr>
+                      <w:t>Distributor B.V.,</w:t>
+                    </w:r>
+                    <w:r>
+                      <w:rPr>
+                        <w:rFonts w:cs="Arial"/>
+                        <w:b/>
+                        <w:bCs/>
+                        <w:color w:val="000000"/>
+                      </w:rPr>
+                      <w:t xml:space="preserve"> Monteur: </w:t>
+                    </w:r>
+                    <w:r>
+                      <w:rPr>
+                        <w:rFonts w:cs="Arial"/>
+                        <w:color w:val="000000"/>
+                      </w:rPr>
+                      <w:t xml:space="preserve">Joost Klein, </w:t>
+                    </w:r>
+                    <w:r>
+                      <w:rPr>
+                        <w:rFonts w:cs="Arial"/>
+                        <w:b/>
+                        <w:bCs/>
+                        <w:color w:val="000000"/>
+                      </w:rPr>
+                      <w:t xml:space="preserve">Klant: </w:t>
+                    </w:r>
+                    <w:r>
+                      <w:rPr>
+                        <w:rFonts w:cs="Arial"/>
+                        <w:color w:val="000000"/>
+                      </w:rPr>
+                      <w:t xml:space="preserve">Customer Ltd. </w:t>
+                    </w:r>
+                    <w:r>
+                      <w:rPr>
+                        <w:rFonts w:cs="Arial"/>
+                        <w:b/>
+                        <w:bCs/>
+                        <w:color w:val="000000"/>
+                      </w:rPr>
+                      <w:t xml:space="preserve">Tijdverschil: </w:t>
+                    </w:r>
+                    <w:r>
+                      <w:rPr>
+                        <w:rFonts w:cs="Arial"/>
+                        <w:color w:val="000000"/>
+                      </w:rPr>
+                      <w:t>GMT+1</w:t>
                     </w:r>
                   </w:p>
                 </w:txbxContent>
@@ -4674,7 +4037,7 @@
       <mc:AlternateContent>
         <mc:Choice Requires="wps">
           <w:drawing>
-            <wp:anchor behindDoc="1" distT="11430" distB="11430" distL="11430" distR="11430" simplePos="0" locked="0" layoutInCell="1" allowOverlap="1" relativeHeight="94" wp14:anchorId="7E69F1F7">
+            <wp:anchor behindDoc="1" distT="11430" distB="11430" distL="11430" distR="11430" simplePos="0" locked="0" layoutInCell="1" allowOverlap="1" relativeHeight="60" wp14:anchorId="7E69F1F7">
               <wp:simplePos x="0" y="0"/>
               <wp:positionH relativeFrom="column">
                 <wp:posOffset>5600700</wp:posOffset>
@@ -4682,7 +4045,7 @@
               <wp:positionV relativeFrom="paragraph">
                 <wp:posOffset>-57785</wp:posOffset>
               </wp:positionV>
-              <wp:extent cx="914400" cy="685800"/>
+              <wp:extent cx="914400" cy="1087120"/>
               <wp:effectExtent l="11430" t="11430" r="11430" b="11430"/>
               <wp:wrapNone/>
               <wp:docPr id="6" name="Text Box 33"/>
@@ -4693,7 +4056,7 @@
                     <wps:spPr>
                       <a:xfrm>
                         <a:off x="0" y="0"/>
-                        <a:ext cx="914400" cy="685800"/>
+                        <a:ext cx="914400" cy="1087200"/>
                       </a:xfrm>
                       <a:prstGeom prst="rect">
                         <a:avLst/>
@@ -4776,7 +4139,7 @@
         </mc:Choice>
         <mc:Fallback>
           <w:pict>
-            <v:rect id="shape_0" ID="Text Box 33" path="m0,0l-2147483645,0l-2147483645,-2147483646l0,-2147483646xe" fillcolor="white" stroked="t" o:allowincell="f" style="position:absolute;margin-left:441pt;margin-top:-4.55pt;width:71.95pt;height:53.95pt;mso-wrap-style:square;v-text-anchor:middle" wp14:anchorId="7E69F1F7">
+            <v:rect id="shape_0" ID="Text Box 33" path="m0,0l-2147483645,0l-2147483645,-2147483646l0,-2147483646xe" fillcolor="white" stroked="t" o:allowincell="f" style="position:absolute;margin-left:441pt;margin-top:-4.55pt;width:71.95pt;height:85.55pt;mso-wrap-style:square;v-text-anchor:middle" wp14:anchorId="7E69F1F7">
               <v:fill o:detectmouseclick="t" type="solid" color2="black"/>
               <v:stroke color="black" weight="22320" joinstyle="miter" endcap="flat"/>
               <v:textbox>
@@ -4836,13 +4199,13 @@
         </mc:Fallback>
       </mc:AlternateContent>
       <w:drawing>
-        <wp:anchor behindDoc="1" distT="0" distB="0" distL="0" distR="0" simplePos="0" locked="0" layoutInCell="1" allowOverlap="1" relativeHeight="101">
+        <wp:anchor behindDoc="1" distT="0" distB="0" distL="0" distR="0" simplePos="0" locked="0" layoutInCell="1" allowOverlap="1" relativeHeight="65">
           <wp:simplePos x="0" y="0"/>
           <wp:positionH relativeFrom="column">
             <wp:posOffset>-203200</wp:posOffset>
           </wp:positionH>
           <wp:positionV relativeFrom="paragraph">
-            <wp:posOffset>59055</wp:posOffset>
+            <wp:posOffset>218440</wp:posOffset>
           </wp:positionV>
           <wp:extent cx="1547495" cy="450215"/>
           <wp:effectExtent l="0" t="0" r="0" b="0"/>
@@ -4902,7 +4265,7 @@
       <mc:AlternateContent>
         <mc:Choice Requires="wps">
           <w:drawing>
-            <wp:anchor behindDoc="1" distT="11430" distB="11430" distL="11430" distR="11430" simplePos="0" locked="0" layoutInCell="1" allowOverlap="1" relativeHeight="6" wp14:anchorId="45E6EC9F">
+            <wp:anchor behindDoc="1" distT="11430" distB="11430" distL="11430" distR="11430" simplePos="0" locked="0" layoutInCell="1" allowOverlap="1" relativeHeight="4" wp14:anchorId="45E6EC9F">
               <wp:simplePos x="0" y="0"/>
               <wp:positionH relativeFrom="column">
                 <wp:posOffset>-342900</wp:posOffset>
@@ -4910,7 +4273,7 @@
               <wp:positionV relativeFrom="paragraph">
                 <wp:posOffset>-57785</wp:posOffset>
               </wp:positionV>
-              <wp:extent cx="1828800" cy="685800"/>
+              <wp:extent cx="1828800" cy="1087755"/>
               <wp:effectExtent l="11430" t="11430" r="11430" b="11430"/>
               <wp:wrapNone/>
               <wp:docPr id="8" name="Rectangle 19"/>
@@ -4921,7 +4284,7 @@
                     <wps:spPr>
                       <a:xfrm>
                         <a:off x="0" y="0"/>
-                        <a:ext cx="1828800" cy="685800"/>
+                        <a:ext cx="1828800" cy="1087920"/>
                       </a:xfrm>
                       <a:prstGeom prst="rect">
                         <a:avLst/>
@@ -4949,7 +4312,7 @@
         </mc:Choice>
         <mc:Fallback>
           <w:pict>
-            <v:rect id="shape_0" ID="Rectangle 19" path="m0,0l-2147483645,0l-2147483645,-2147483646l0,-2147483646xe" stroked="t" o:allowincell="f" style="position:absolute;margin-left:-27pt;margin-top:-4.55pt;width:143.95pt;height:53.95pt;mso-wrap-style:none;v-text-anchor:middle" wp14:anchorId="45E6EC9F">
+            <v:rect id="shape_0" ID="Rectangle 19" path="m0,0l-2147483645,0l-2147483645,-2147483646l0,-2147483646xe" stroked="t" o:allowincell="f" style="position:absolute;margin-left:-27pt;margin-top:-4.55pt;width:143.95pt;height:85.6pt;mso-wrap-style:none;v-text-anchor:middle" wp14:anchorId="45E6EC9F">
               <v:fill o:detectmouseclick="t" on="false"/>
               <v:stroke color="black" weight="22320" joinstyle="miter" endcap="flat"/>
               <w10:wrap type="none"/>
@@ -4960,7 +4323,7 @@
       <mc:AlternateContent>
         <mc:Choice Requires="wps">
           <w:drawing>
-            <wp:anchor behindDoc="1" distT="11430" distB="11430" distL="11430" distR="11430" simplePos="0" locked="0" layoutInCell="1" allowOverlap="1" relativeHeight="12" wp14:anchorId="1BD92560">
+            <wp:anchor behindDoc="1" distT="11430" distB="11430" distL="11430" distR="11430" simplePos="0" locked="0" layoutInCell="1" allowOverlap="1" relativeHeight="8" wp14:anchorId="1BD92560">
               <wp:simplePos x="0" y="0"/>
               <wp:positionH relativeFrom="column">
                 <wp:posOffset>6515100</wp:posOffset>
@@ -5017,7 +4380,7 @@
       <mc:AlternateContent>
         <mc:Choice Requires="wps">
           <w:drawing>
-            <wp:anchor behindDoc="1" distT="11430" distB="11430" distL="11430" distR="11430" simplePos="0" locked="0" layoutInCell="1" allowOverlap="1" relativeHeight="18" wp14:anchorId="2D1772F5">
+            <wp:anchor behindDoc="1" distT="11430" distB="11430" distL="11430" distR="11430" simplePos="0" locked="0" layoutInCell="1" allowOverlap="1" relativeHeight="12" wp14:anchorId="2D1772F5">
               <wp:simplePos x="0" y="0"/>
               <wp:positionH relativeFrom="column">
                 <wp:posOffset>-342900</wp:posOffset>
@@ -5074,7 +4437,7 @@
       <mc:AlternateContent>
         <mc:Choice Requires="wps">
           <w:drawing>
-            <wp:anchor behindDoc="1" distT="0" distB="1270" distL="0" distR="0" simplePos="0" locked="0" layoutInCell="1" allowOverlap="1" relativeHeight="72" wp14:anchorId="5AA79684">
+            <wp:anchor behindDoc="1" distT="0" distB="1270" distL="0" distR="0" simplePos="0" locked="0" layoutInCell="1" allowOverlap="1" relativeHeight="18" wp14:anchorId="5AA79684">
               <wp:simplePos x="0" y="0"/>
               <wp:positionH relativeFrom="column">
                 <wp:posOffset>1828800</wp:posOffset>
@@ -5171,7 +4534,7 @@
       <mc:AlternateContent>
         <mc:Choice Requires="wps">
           <w:drawing>
-            <wp:anchor behindDoc="1" distT="11430" distB="11430" distL="11430" distR="11430" simplePos="0" locked="0" layoutInCell="1" allowOverlap="1" relativeHeight="83" wp14:anchorId="107AA7BE">
+            <wp:anchor behindDoc="1" distT="11430" distB="11430" distL="11430" distR="11430" simplePos="0" locked="0" layoutInCell="1" allowOverlap="1" relativeHeight="25" wp14:anchorId="107AA7BE">
               <wp:simplePos x="0" y="0"/>
               <wp:positionH relativeFrom="column">
                 <wp:posOffset>1485900</wp:posOffset>
@@ -5179,7 +4542,7 @@
               <wp:positionV relativeFrom="paragraph">
                 <wp:posOffset>-57785</wp:posOffset>
               </wp:positionV>
-              <wp:extent cx="4114800" cy="685800"/>
+              <wp:extent cx="4114800" cy="1087120"/>
               <wp:effectExtent l="11430" t="11430" r="11430" b="11430"/>
               <wp:wrapNone/>
               <wp:docPr id="12" name="Text Box 31"/>
@@ -5190,7 +4553,7 @@
                     <wps:spPr>
                       <a:xfrm>
                         <a:off x="0" y="0"/>
-                        <a:ext cx="4114800" cy="685800"/>
+                        <a:ext cx="4114800" cy="1087200"/>
                       </a:xfrm>
                       <a:prstGeom prst="rect">
                         <a:avLst/>
@@ -5244,9 +4607,34 @@
                           <w:r>
                             <w:rPr>
                               <w:rFonts w:cs="Arial"/>
-                              <w:color w:val="000000"/>
-                            </w:rPr>
-                            <w:t>202600123</w:t>
+                              <w:b/>
+                              <w:bCs/>
+                              <w:color w:val="000000"/>
+                            </w:rPr>
+                            <w:t xml:space="preserve">Meldingnummer: </w:t>
+                          </w:r>
+                          <w:r>
+                            <w:rPr>
+                              <w:rFonts w:cs="Arial"/>
+                              <w:color w:val="000000"/>
+                            </w:rPr>
+                            <w:t xml:space="preserve">202600123, </w:t>
+                          </w:r>
+                          <w:r>
+                            <w:rPr>
+                              <w:rFonts w:cs="Arial"/>
+                              <w:b/>
+                              <w:bCs/>
+                              <w:color w:val="000000"/>
+                            </w:rPr>
+                            <w:t xml:space="preserve">Machinenummer: </w:t>
+                          </w:r>
+                          <w:r>
+                            <w:rPr>
+                              <w:rFonts w:cs="Arial"/>
+                              <w:color w:val="000000"/>
+                            </w:rPr>
+                            <w:t>MCH-2024-00158</w:t>
                           </w:r>
                         </w:p>
                         <w:p>
@@ -5260,23 +4648,66 @@
                           <w:r>
                             <w:rPr>
                               <w:rFonts w:cs="Arial"/>
-                              <w:color w:val="000000"/>
-                            </w:rPr>
-                            <w:t xml:space="preserve">Distributor B.V., Joost Klein, Customer Ltd. </w:t>
-                          </w:r>
-                          <w:r>
-                            <w:rPr>
-                              <w:rFonts w:cs="Arial"/>
-                              <w:color w:val="000000"/>
-                            </w:rPr>
-                            <w:t>GMT</w:t>
-                          </w:r>
-                          <w:r>
-                            <w:rPr>
-                              <w:rFonts w:cs="Arial"/>
-                              <w:color w:val="000000"/>
-                            </w:rPr>
-                            <w:t>+1</w:t>
+                              <w:b/>
+                              <w:bCs/>
+                              <w:color w:val="000000"/>
+                            </w:rPr>
+                            <w:t xml:space="preserve">Distributeur: </w:t>
+                          </w:r>
+                          <w:r>
+                            <w:rPr>
+                              <w:rFonts w:cs="Arial"/>
+                              <w:color w:val="000000"/>
+                            </w:rPr>
+                            <w:t>Distributor B.V.,</w:t>
+                          </w:r>
+                          <w:r>
+                            <w:rPr>
+                              <w:rFonts w:cs="Arial"/>
+                              <w:b/>
+                              <w:bCs/>
+                              <w:color w:val="000000"/>
+                            </w:rPr>
+                            <w:t xml:space="preserve"> Monteur: </w:t>
+                          </w:r>
+                          <w:r>
+                            <w:rPr>
+                              <w:rFonts w:cs="Arial"/>
+                              <w:color w:val="000000"/>
+                            </w:rPr>
+                            <w:t xml:space="preserve">Joost Klein, </w:t>
+                          </w:r>
+                          <w:r>
+                            <w:rPr>
+                              <w:rFonts w:cs="Arial"/>
+                              <w:b/>
+                              <w:bCs/>
+                              <w:color w:val="000000"/>
+                            </w:rPr>
+                            <w:t xml:space="preserve">Klant: </w:t>
+                          </w:r>
+                          <w:r>
+                            <w:rPr>
+                              <w:rFonts w:cs="Arial"/>
+                              <w:color w:val="000000"/>
+                            </w:rPr>
+                            <w:t xml:space="preserve">Customer Ltd. </w:t>
+                          </w:r>
+                          <w:r>
+                            <w:rPr>
+                              <w:rFonts w:cs="Arial"/>
+                              <w:b/>
+                              <w:bCs/>
+                              <w:color w:val="000000"/>
+                            </w:rPr>
+                            <w:t xml:space="preserve">Tijdverschil: </w:t>
+                          </w:r>
+                          <w:r>
+                            <w:rPr>
+                              <w:rFonts w:cs="Arial"/>
+                              <w:color w:val="000000"/>
+                            </w:rPr>
+                            <w:t>GMT+1</w:t>
                           </w:r>
                         </w:p>
                       </w:txbxContent>
@@ -5292,7 +4723,7 @@
         </mc:Choice>
         <mc:Fallback>
           <w:pict>
-            <v:rect id="shape_0" ID="Text Box 31" path="m0,0l-2147483645,0l-2147483645,-2147483646l0,-2147483646xe" fillcolor="white" stroked="t" o:allowincell="f" style="position:absolute;margin-left:117pt;margin-top:-4.55pt;width:323.95pt;height:53.95pt;mso-wrap-style:square;v-text-anchor:middle" wp14:anchorId="107AA7BE">
+            <v:rect id="shape_0" ID="Text Box 31" path="m0,0l-2147483645,0l-2147483645,-2147483646l0,-2147483646xe" fillcolor="white" stroked="t" o:allowincell="f" style="position:absolute;margin-left:117pt;margin-top:-4.55pt;width:323.95pt;height:85.55pt;mso-wrap-style:square;v-text-anchor:middle" wp14:anchorId="107AA7BE">
               <v:fill o:detectmouseclick="t" type="solid" color2="black"/>
               <v:stroke color="black" weight="22320" joinstyle="miter" endcap="flat"/>
               <v:textbox>
@@ -5328,9 +4759,34 @@
                     <w:r>
                       <w:rPr>
                         <w:rFonts w:cs="Arial"/>
-                        <w:color w:val="000000"/>
-                      </w:rPr>
-                      <w:t>202600123</w:t>
+                        <w:b/>
+                        <w:bCs/>
+                        <w:color w:val="000000"/>
+                      </w:rPr>
+                      <w:t xml:space="preserve">Meldingnummer: </w:t>
+                    </w:r>
+                    <w:r>
+                      <w:rPr>
+                        <w:rFonts w:cs="Arial"/>
+                        <w:color w:val="000000"/>
+                      </w:rPr>
+                      <w:t xml:space="preserve">202600123, </w:t>
+                    </w:r>
+                    <w:r>
+                      <w:rPr>
+                        <w:rFonts w:cs="Arial"/>
+                        <w:b/>
+                        <w:bCs/>
+                        <w:color w:val="000000"/>
+                      </w:rPr>
+                      <w:t xml:space="preserve">Machinenummer: </w:t>
+                    </w:r>
+                    <w:r>
+                      <w:rPr>
+                        <w:rFonts w:cs="Arial"/>
+                        <w:color w:val="000000"/>
+                      </w:rPr>
+                      <w:t>MCH-2024-00158</w:t>
                     </w:r>
                   </w:p>
                   <w:p>
@@ -5344,23 +4800,66 @@
                     <w:r>
                       <w:rPr>
                         <w:rFonts w:cs="Arial"/>
-                        <w:color w:val="000000"/>
-                      </w:rPr>
-                      <w:t xml:space="preserve">Distributor B.V., Joost Klein, Customer Ltd. </w:t>
-                    </w:r>
-                    <w:r>
-                      <w:rPr>
-                        <w:rFonts w:cs="Arial"/>
-                        <w:color w:val="000000"/>
-                      </w:rPr>
-                      <w:t>GMT</w:t>
-                    </w:r>
-                    <w:r>
-                      <w:rPr>
-                        <w:rFonts w:cs="Arial"/>
-                        <w:color w:val="000000"/>
-                      </w:rPr>
-                      <w:t>+1</w:t>
+                        <w:b/>
+                        <w:bCs/>
+                        <w:color w:val="000000"/>
+                      </w:rPr>
+                      <w:t xml:space="preserve">Distributeur: </w:t>
+                    </w:r>
+                    <w:r>
+                      <w:rPr>
+                        <w:rFonts w:cs="Arial"/>
+                        <w:color w:val="000000"/>
+                      </w:rPr>
+                      <w:t>Distributor B.V.,</w:t>
+                    </w:r>
+                    <w:r>
+                      <w:rPr>
+                        <w:rFonts w:cs="Arial"/>
+                        <w:b/>
+                        <w:bCs/>
+                        <w:color w:val="000000"/>
+                      </w:rPr>
+                      <w:t xml:space="preserve"> Monteur: </w:t>
+                    </w:r>
+                    <w:r>
+                      <w:rPr>
+                        <w:rFonts w:cs="Arial"/>
+                        <w:color w:val="000000"/>
+                      </w:rPr>
+                      <w:t xml:space="preserve">Joost Klein, </w:t>
+                    </w:r>
+                    <w:r>
+                      <w:rPr>
+                        <w:rFonts w:cs="Arial"/>
+                        <w:b/>
+                        <w:bCs/>
+                        <w:color w:val="000000"/>
+                      </w:rPr>
+                      <w:t xml:space="preserve">Klant: </w:t>
+                    </w:r>
+                    <w:r>
+                      <w:rPr>
+                        <w:rFonts w:cs="Arial"/>
+                        <w:color w:val="000000"/>
+                      </w:rPr>
+                      <w:t xml:space="preserve">Customer Ltd. </w:t>
+                    </w:r>
+                    <w:r>
+                      <w:rPr>
+                        <w:rFonts w:cs="Arial"/>
+                        <w:b/>
+                        <w:bCs/>
+                        <w:color w:val="000000"/>
+                      </w:rPr>
+                      <w:t xml:space="preserve">Tijdverschil: </w:t>
+                    </w:r>
+                    <w:r>
+                      <w:rPr>
+                        <w:rFonts w:cs="Arial"/>
+                        <w:color w:val="000000"/>
+                      </w:rPr>
+                      <w:t>GMT+1</w:t>
                     </w:r>
                   </w:p>
                 </w:txbxContent>
@@ -5373,7 +4872,7 @@
       <mc:AlternateContent>
         <mc:Choice Requires="wps">
           <w:drawing>
-            <wp:anchor behindDoc="1" distT="11430" distB="11430" distL="11430" distR="11430" simplePos="0" locked="0" layoutInCell="1" allowOverlap="1" relativeHeight="94" wp14:anchorId="7E69F1F7">
+            <wp:anchor behindDoc="1" distT="11430" distB="11430" distL="11430" distR="11430" simplePos="0" locked="0" layoutInCell="1" allowOverlap="1" relativeHeight="60" wp14:anchorId="7E69F1F7">
               <wp:simplePos x="0" y="0"/>
               <wp:positionH relativeFrom="column">
                 <wp:posOffset>5600700</wp:posOffset>
@@ -5381,7 +4880,7 @@
               <wp:positionV relativeFrom="paragraph">
                 <wp:posOffset>-57785</wp:posOffset>
               </wp:positionV>
-              <wp:extent cx="914400" cy="685800"/>
+              <wp:extent cx="914400" cy="1087120"/>
               <wp:effectExtent l="11430" t="11430" r="11430" b="11430"/>
               <wp:wrapNone/>
               <wp:docPr id="13" name="Text Box 33"/>
@@ -5392,7 +4891,7 @@
                     <wps:spPr>
                       <a:xfrm>
                         <a:off x="0" y="0"/>
-                        <a:ext cx="914400" cy="685800"/>
+                        <a:ext cx="914400" cy="1087200"/>
                       </a:xfrm>
                       <a:prstGeom prst="rect">
                         <a:avLst/>
@@ -5475,7 +4974,7 @@
         </mc:Choice>
         <mc:Fallback>
           <w:pict>
-            <v:rect id="shape_0" ID="Text Box 33" path="m0,0l-2147483645,0l-2147483645,-2147483646l0,-2147483646xe" fillcolor="white" stroked="t" o:allowincell="f" style="position:absolute;margin-left:441pt;margin-top:-4.55pt;width:71.95pt;height:53.95pt;mso-wrap-style:square;v-text-anchor:middle" wp14:anchorId="7E69F1F7">
+            <v:rect id="shape_0" ID="Text Box 33" path="m0,0l-2147483645,0l-2147483645,-2147483646l0,-2147483646xe" fillcolor="white" stroked="t" o:allowincell="f" style="position:absolute;margin-left:441pt;margin-top:-4.55pt;width:71.95pt;height:85.55pt;mso-wrap-style:square;v-text-anchor:middle" wp14:anchorId="7E69F1F7">
               <v:fill o:detectmouseclick="t" type="solid" color2="black"/>
               <v:stroke color="black" weight="22320" joinstyle="miter" endcap="flat"/>
               <v:textbox>
@@ -5535,13 +5034,13 @@
         </mc:Fallback>
       </mc:AlternateContent>
       <w:drawing>
-        <wp:anchor behindDoc="1" distT="0" distB="0" distL="0" distR="0" simplePos="0" locked="0" layoutInCell="1" allowOverlap="1" relativeHeight="101">
+        <wp:anchor behindDoc="1" distT="0" distB="0" distL="0" distR="0" simplePos="0" locked="0" layoutInCell="1" allowOverlap="1" relativeHeight="65">
           <wp:simplePos x="0" y="0"/>
           <wp:positionH relativeFrom="column">
             <wp:posOffset>-203200</wp:posOffset>
           </wp:positionH>
           <wp:positionV relativeFrom="paragraph">
-            <wp:posOffset>59055</wp:posOffset>
+            <wp:posOffset>218440</wp:posOffset>
           </wp:positionV>
           <wp:extent cx="1547495" cy="450215"/>
           <wp:effectExtent l="0" t="0" r="0" b="0"/>
@@ -6073,280 +5572,6 @@
   </w:abstractNum>
   <w:abstractNum w:abstractNumId="4">
     <w:lvl w:ilvl="0">
-      <w:start w:val="18"/>
-      <w:numFmt w:val="bullet"/>
-      <w:lvlText w:val="-"/>
-      <w:lvlJc w:val="left"/>
-      <w:pPr>
-        <w:tabs>
-          <w:tab w:val="num" w:pos="0"/>
-        </w:tabs>
-        <w:ind w:left="720" w:hanging="360"/>
-      </w:pPr>
-      <w:rPr>
-        <w:rFonts w:ascii="Calibri" w:hAnsi="Calibri" w:cs="Calibri" w:hint="default"/>
-      </w:rPr>
-    </w:lvl>
-    <w:lvl w:ilvl="1">
-      <w:start w:val="1"/>
-      <w:numFmt w:val="bullet"/>
-      <w:lvlText w:val="o"/>
-      <w:lvlJc w:val="left"/>
-      <w:pPr>
-        <w:tabs>
-          <w:tab w:val="num" w:pos="0"/>
-        </w:tabs>
-        <w:ind w:left="1440" w:hanging="360"/>
-      </w:pPr>
-      <w:rPr>
-        <w:rFonts w:ascii="Courier New" w:hAnsi="Courier New" w:cs="Courier New" w:hint="default"/>
-      </w:rPr>
-    </w:lvl>
-    <w:lvl w:ilvl="2">
-      <w:start w:val="1"/>
-      <w:numFmt w:val="bullet"/>
-      <w:lvlText w:val=""/>
-      <w:lvlJc w:val="left"/>
-      <w:pPr>
-        <w:tabs>
-          <w:tab w:val="num" w:pos="0"/>
-        </w:tabs>
-        <w:ind w:left="2160" w:hanging="360"/>
-      </w:pPr>
-      <w:rPr>
-        <w:rFonts w:ascii="Wingdings" w:hAnsi="Wingdings" w:cs="Wingdings" w:hint="default"/>
-      </w:rPr>
-    </w:lvl>
-    <w:lvl w:ilvl="3">
-      <w:start w:val="1"/>
-      <w:numFmt w:val="bullet"/>
-      <w:lvlText w:val=""/>
-      <w:lvlJc w:val="left"/>
-      <w:pPr>
-        <w:tabs>
-          <w:tab w:val="num" w:pos="0"/>
-        </w:tabs>
-        <w:ind w:left="2880" w:hanging="360"/>
-      </w:pPr>
-      <w:rPr>
-        <w:rFonts w:ascii="Symbol" w:hAnsi="Symbol" w:cs="Symbol" w:hint="default"/>
-      </w:rPr>
-    </w:lvl>
-    <w:lvl w:ilvl="4">
-      <w:start w:val="1"/>
-      <w:numFmt w:val="bullet"/>
-      <w:lvlText w:val="o"/>
-      <w:lvlJc w:val="left"/>
-      <w:pPr>
-        <w:tabs>
-          <w:tab w:val="num" w:pos="0"/>
-        </w:tabs>
-        <w:ind w:left="3600" w:hanging="360"/>
-      </w:pPr>
-      <w:rPr>
-        <w:rFonts w:ascii="Courier New" w:hAnsi="Courier New" w:cs="Courier New" w:hint="default"/>
-      </w:rPr>
-    </w:lvl>
-    <w:lvl w:ilvl="5">
-      <w:start w:val="1"/>
-      <w:numFmt w:val="bullet"/>
-      <w:lvlText w:val=""/>
-      <w:lvlJc w:val="left"/>
-      <w:pPr>
-        <w:tabs>
-          <w:tab w:val="num" w:pos="0"/>
-        </w:tabs>
-        <w:ind w:left="4320" w:hanging="360"/>
-      </w:pPr>
-      <w:rPr>
-        <w:rFonts w:ascii="Wingdings" w:hAnsi="Wingdings" w:cs="Wingdings" w:hint="default"/>
-      </w:rPr>
-    </w:lvl>
-    <w:lvl w:ilvl="6">
-      <w:start w:val="1"/>
-      <w:numFmt w:val="bullet"/>
-      <w:lvlText w:val=""/>
-      <w:lvlJc w:val="left"/>
-      <w:pPr>
-        <w:tabs>
-          <w:tab w:val="num" w:pos="0"/>
-        </w:tabs>
-        <w:ind w:left="5040" w:hanging="360"/>
-      </w:pPr>
-      <w:rPr>
-        <w:rFonts w:ascii="Symbol" w:hAnsi="Symbol" w:cs="Symbol" w:hint="default"/>
-      </w:rPr>
-    </w:lvl>
-    <w:lvl w:ilvl="7">
-      <w:start w:val="1"/>
-      <w:numFmt w:val="bullet"/>
-      <w:lvlText w:val="o"/>
-      <w:lvlJc w:val="left"/>
-      <w:pPr>
-        <w:tabs>
-          <w:tab w:val="num" w:pos="0"/>
-        </w:tabs>
-        <w:ind w:left="5760" w:hanging="360"/>
-      </w:pPr>
-      <w:rPr>
-        <w:rFonts w:ascii="Courier New" w:hAnsi="Courier New" w:cs="Courier New" w:hint="default"/>
-      </w:rPr>
-    </w:lvl>
-    <w:lvl w:ilvl="8">
-      <w:start w:val="1"/>
-      <w:numFmt w:val="bullet"/>
-      <w:lvlText w:val=""/>
-      <w:lvlJc w:val="left"/>
-      <w:pPr>
-        <w:tabs>
-          <w:tab w:val="num" w:pos="0"/>
-        </w:tabs>
-        <w:ind w:left="6480" w:hanging="360"/>
-      </w:pPr>
-      <w:rPr>
-        <w:rFonts w:ascii="Wingdings" w:hAnsi="Wingdings" w:cs="Wingdings" w:hint="default"/>
-      </w:rPr>
-    </w:lvl>
-  </w:abstractNum>
-  <w:abstractNum w:abstractNumId="5">
-    <w:lvl w:ilvl="0">
-      <w:start w:val="1"/>
-      <w:numFmt w:val="bullet"/>
-      <w:lvlText w:val="-"/>
-      <w:lvlJc w:val="left"/>
-      <w:pPr>
-        <w:tabs>
-          <w:tab w:val="num" w:pos="720"/>
-        </w:tabs>
-        <w:ind w:left="720" w:hanging="360"/>
-      </w:pPr>
-      <w:rPr>
-        <w:rFonts w:ascii="OpenSymbol" w:hAnsi="OpenSymbol" w:cs="OpenSymbol" w:hint="default"/>
-      </w:rPr>
-    </w:lvl>
-    <w:lvl w:ilvl="1">
-      <w:start w:val="1"/>
-      <w:numFmt w:val="bullet"/>
-      <w:lvlText w:val=""/>
-      <w:lvlJc w:val="left"/>
-      <w:pPr>
-        <w:tabs>
-          <w:tab w:val="num" w:pos="1080"/>
-        </w:tabs>
-        <w:ind w:left="1080" w:hanging="360"/>
-      </w:pPr>
-      <w:rPr>
-        <w:rFonts w:ascii="Symbol" w:hAnsi="Symbol" w:cs="Symbol" w:hint="default"/>
-      </w:rPr>
-    </w:lvl>
-    <w:lvl w:ilvl="2">
-      <w:start w:val="1"/>
-      <w:numFmt w:val="bullet"/>
-      <w:lvlText w:val=""/>
-      <w:lvlJc w:val="left"/>
-      <w:pPr>
-        <w:tabs>
-          <w:tab w:val="num" w:pos="1440"/>
-        </w:tabs>
-        <w:ind w:left="1440" w:hanging="360"/>
-      </w:pPr>
-      <w:rPr>
-        <w:rFonts w:ascii="Symbol" w:hAnsi="Symbol" w:cs="Symbol" w:hint="default"/>
-      </w:rPr>
-    </w:lvl>
-    <w:lvl w:ilvl="3">
-      <w:start w:val="1"/>
-      <w:numFmt w:val="bullet"/>
-      <w:lvlText w:val=""/>
-      <w:lvlJc w:val="left"/>
-      <w:pPr>
-        <w:tabs>
-          <w:tab w:val="num" w:pos="1800"/>
-        </w:tabs>
-        <w:ind w:left="1800" w:hanging="360"/>
-      </w:pPr>
-      <w:rPr>
-        <w:rFonts w:ascii="Symbol" w:hAnsi="Symbol" w:cs="Symbol" w:hint="default"/>
-      </w:rPr>
-    </w:lvl>
-    <w:lvl w:ilvl="4">
-      <w:start w:val="1"/>
-      <w:numFmt w:val="bullet"/>
-      <w:lvlText w:val=""/>
-      <w:lvlJc w:val="left"/>
-      <w:pPr>
-        <w:tabs>
-          <w:tab w:val="num" w:pos="2160"/>
-        </w:tabs>
-        <w:ind w:left="2160" w:hanging="360"/>
-      </w:pPr>
-      <w:rPr>
-        <w:rFonts w:ascii="Symbol" w:hAnsi="Symbol" w:cs="Symbol" w:hint="default"/>
-      </w:rPr>
-    </w:lvl>
-    <w:lvl w:ilvl="5">
-      <w:start w:val="1"/>
-      <w:numFmt w:val="bullet"/>
-      <w:lvlText w:val=""/>
-      <w:lvlJc w:val="left"/>
-      <w:pPr>
-        <w:tabs>
-          <w:tab w:val="num" w:pos="2520"/>
-        </w:tabs>
-        <w:ind w:left="2520" w:hanging="360"/>
-      </w:pPr>
-      <w:rPr>
-        <w:rFonts w:ascii="Symbol" w:hAnsi="Symbol" w:cs="Symbol" w:hint="default"/>
-      </w:rPr>
-    </w:lvl>
-    <w:lvl w:ilvl="6">
-      <w:start w:val="1"/>
-      <w:numFmt w:val="bullet"/>
-      <w:lvlText w:val=""/>
-      <w:lvlJc w:val="left"/>
-      <w:pPr>
-        <w:tabs>
-          <w:tab w:val="num" w:pos="2880"/>
-        </w:tabs>
-        <w:ind w:left="2880" w:hanging="360"/>
-      </w:pPr>
-      <w:rPr>
-        <w:rFonts w:ascii="Symbol" w:hAnsi="Symbol" w:cs="Symbol" w:hint="default"/>
-      </w:rPr>
-    </w:lvl>
-    <w:lvl w:ilvl="7">
-      <w:start w:val="1"/>
-      <w:numFmt w:val="bullet"/>
-      <w:lvlText w:val=""/>
-      <w:lvlJc w:val="left"/>
-      <w:pPr>
-        <w:tabs>
-          <w:tab w:val="num" w:pos="3240"/>
-        </w:tabs>
-        <w:ind w:left="3240" w:hanging="360"/>
-      </w:pPr>
-      <w:rPr>
-        <w:rFonts w:ascii="Symbol" w:hAnsi="Symbol" w:cs="Symbol" w:hint="default"/>
-      </w:rPr>
-    </w:lvl>
-    <w:lvl w:ilvl="8">
-      <w:start w:val="1"/>
-      <w:numFmt w:val="bullet"/>
-      <w:lvlText w:val=""/>
-      <w:lvlJc w:val="left"/>
-      <w:pPr>
-        <w:tabs>
-          <w:tab w:val="num" w:pos="3600"/>
-        </w:tabs>
-        <w:ind w:left="3600" w:hanging="360"/>
-      </w:pPr>
-      <w:rPr>
-        <w:rFonts w:ascii="Symbol" w:hAnsi="Symbol" w:cs="Symbol" w:hint="default"/>
-      </w:rPr>
-    </w:lvl>
-  </w:abstractNum>
-  <w:abstractNum w:abstractNumId="6">
-    <w:lvl w:ilvl="0">
       <w:start w:val="1"/>
       <w:numFmt w:val="decimal"/>
       <w:lvlText w:val="%1."/>
@@ -6518,7 +5743,7 @@
       <w:rPr/>
     </w:lvl>
   </w:abstractNum>
-  <w:abstractNum w:abstractNumId="7">
+  <w:abstractNum w:abstractNumId="5">
     <w:lvl w:ilvl="0">
       <w:start w:val="1"/>
       <w:numFmt w:val="decimal"/>
@@ -6691,7 +5916,7 @@
       <w:rPr/>
     </w:lvl>
   </w:abstractNum>
-  <w:abstractNum w:abstractNumId="8">
+  <w:abstractNum w:abstractNumId="6">
     <w:lvl w:ilvl="0">
       <w:start w:val="1"/>
       <w:numFmt w:val="decimal"/>
@@ -6864,7 +6089,7 @@
       <w:rPr/>
     </w:lvl>
   </w:abstractNum>
-  <w:abstractNum w:abstractNumId="9">
+  <w:abstractNum w:abstractNumId="7">
     <w:lvl w:ilvl="0">
       <w:start w:val="1"/>
       <w:numFmt w:val="decimal"/>
@@ -7037,7 +6262,7 @@
       <w:rPr/>
     </w:lvl>
   </w:abstractNum>
-  <w:abstractNum w:abstractNumId="10">
+  <w:abstractNum w:abstractNumId="8">
     <w:lvl w:ilvl="0">
       <w:start w:val="1"/>
       <w:numFmt w:val="decimal"/>
@@ -7210,7 +6435,7 @@
       <w:rPr/>
     </w:lvl>
   </w:abstractNum>
-  <w:abstractNum w:abstractNumId="11">
+  <w:abstractNum w:abstractNumId="9">
     <w:lvl w:ilvl="0">
       <w:start w:val="1"/>
       <w:numFmt w:val="decimal"/>
@@ -7383,353 +6608,7 @@
       <w:rPr/>
     </w:lvl>
   </w:abstractNum>
-  <w:abstractNum w:abstractNumId="12">
-    <w:lvl w:ilvl="0">
-      <w:start w:val="1"/>
-      <w:numFmt w:val="decimal"/>
-      <w:lvlText w:val="%1."/>
-      <w:lvlJc w:val="left"/>
-      <w:pPr>
-        <w:tabs>
-          <w:tab w:val="num" w:pos="0"/>
-        </w:tabs>
-        <w:ind w:left="360" w:hanging="360"/>
-      </w:pPr>
-      <w:rPr/>
-    </w:lvl>
-    <w:lvl w:ilvl="1">
-      <w:start w:val="1"/>
-      <w:numFmt w:val="decimal"/>
-      <w:lvlText w:val="%1.%2."/>
-      <w:lvlJc w:val="left"/>
-      <w:pPr>
-        <w:tabs>
-          <w:tab w:val="num" w:pos="0"/>
-        </w:tabs>
-        <w:ind w:left="792" w:hanging="432"/>
-      </w:pPr>
-      <w:rPr/>
-    </w:lvl>
-    <w:lvl w:ilvl="2">
-      <w:start w:val="1"/>
-      <w:numFmt w:val="decimal"/>
-      <w:lvlText w:val="%1.%2.%3."/>
-      <w:lvlJc w:val="left"/>
-      <w:pPr>
-        <w:tabs>
-          <w:tab w:val="num" w:pos="0"/>
-        </w:tabs>
-        <w:ind w:left="1224" w:hanging="504"/>
-      </w:pPr>
-      <w:rPr>
-        <w:smallCaps w:val="false"/>
-        <w:caps w:val="false"/>
-        <w:dstrike w:val="false"/>
-        <w:strike w:val="false"/>
-        <w:vertAlign w:val="baseline"/>
-        <w:position w:val="0"/>
-        <w:sz w:val="20"/>
-        <w:sz w:val="20"/>
-        <w:spacing w:val="0"/>
-        <w:i w:val="false"/>
-        <w:u w:val="none"/>
-        <w:b w:val="false"/>
-        <w:kern w:val="0"/>
-        <w:iCs w:val="false"/>
-        <w:bCs w:val="false"/>
-        <w:em w:val="none"/>
-        <w:vanish w:val="false"/>
-        <w:color w:val="000000"/>
-        <w14:shadow w14:blurRad="0" w14:dist="0" w14:dir="0" w14:sx="0" w14:sy="0" w14:kx="0" w14:ky="0" w14:algn="none">
-          <w14:srgbClr w14:val="000000"/>
-        </w14:shadow>
-        <w14:textOutline w14:w="0" w14:cap="rnd" w14:cmpd="sng" w14:algn="ctr">
-          <w14:noFill/>
-          <w14:prstDash w14:val="solid"/>
-          <w14:bevel/>
-        </w14:textOutline>
-      </w:rPr>
-    </w:lvl>
-    <w:lvl w:ilvl="3">
-      <w:start w:val="1"/>
-      <w:numFmt w:val="decimal"/>
-      <w:lvlText w:val="%1.%2.%3.%4."/>
-      <w:lvlJc w:val="left"/>
-      <w:pPr>
-        <w:tabs>
-          <w:tab w:val="num" w:pos="0"/>
-        </w:tabs>
-        <w:ind w:left="1728" w:hanging="648"/>
-      </w:pPr>
-      <w:rPr>
-        <w:smallCaps w:val="false"/>
-        <w:caps w:val="false"/>
-        <w:dstrike w:val="false"/>
-        <w:strike w:val="false"/>
-        <w:vertAlign w:val="baseline"/>
-        <w:position w:val="0"/>
-        <w:sz w:val="20"/>
-        <w:sz w:val="20"/>
-        <w:spacing w:val="0"/>
-        <w:i w:val="false"/>
-        <w:u w:val="none"/>
-        <w:b w:val="false"/>
-        <w:kern w:val="0"/>
-        <w:iCs w:val="false"/>
-        <w:bCs w:val="false"/>
-        <w:em w:val="none"/>
-        <w:vanish w:val="false"/>
-        <w:color w:val="000000"/>
-        <w14:shadow w14:blurRad="0" w14:dist="0" w14:dir="0" w14:sx="0" w14:sy="0" w14:kx="0" w14:ky="0" w14:algn="none">
-          <w14:srgbClr w14:val="000000"/>
-        </w14:shadow>
-        <w14:textOutline w14:w="0" w14:cap="rnd" w14:cmpd="sng" w14:algn="ctr">
-          <w14:noFill/>
-          <w14:prstDash w14:val="solid"/>
-          <w14:bevel/>
-        </w14:textOutline>
-      </w:rPr>
-    </w:lvl>
-    <w:lvl w:ilvl="4">
-      <w:start w:val="1"/>
-      <w:numFmt w:val="decimal"/>
-      <w:lvlText w:val="%1.%2.%3.%4.%5."/>
-      <w:lvlJc w:val="left"/>
-      <w:pPr>
-        <w:tabs>
-          <w:tab w:val="num" w:pos="0"/>
-        </w:tabs>
-        <w:ind w:left="2232" w:hanging="792"/>
-      </w:pPr>
-      <w:rPr/>
-    </w:lvl>
-    <w:lvl w:ilvl="5">
-      <w:start w:val="1"/>
-      <w:numFmt w:val="decimal"/>
-      <w:lvlText w:val="%1.%2.%3.%4.%5.%6."/>
-      <w:lvlJc w:val="left"/>
-      <w:pPr>
-        <w:tabs>
-          <w:tab w:val="num" w:pos="0"/>
-        </w:tabs>
-        <w:ind w:left="2736" w:hanging="936"/>
-      </w:pPr>
-      <w:rPr/>
-    </w:lvl>
-    <w:lvl w:ilvl="6">
-      <w:start w:val="1"/>
-      <w:numFmt w:val="decimal"/>
-      <w:lvlText w:val="%1.%2.%3.%4.%5.%6.%7."/>
-      <w:lvlJc w:val="left"/>
-      <w:pPr>
-        <w:tabs>
-          <w:tab w:val="num" w:pos="0"/>
-        </w:tabs>
-        <w:ind w:left="3240" w:hanging="1080"/>
-      </w:pPr>
-      <w:rPr/>
-    </w:lvl>
-    <w:lvl w:ilvl="7">
-      <w:start w:val="1"/>
-      <w:numFmt w:val="decimal"/>
-      <w:lvlText w:val="%1.%2.%3.%4.%5.%6.%7.%8."/>
-      <w:lvlJc w:val="left"/>
-      <w:pPr>
-        <w:tabs>
-          <w:tab w:val="num" w:pos="0"/>
-        </w:tabs>
-        <w:ind w:left="3744" w:hanging="1224"/>
-      </w:pPr>
-      <w:rPr/>
-    </w:lvl>
-    <w:lvl w:ilvl="8">
-      <w:start w:val="1"/>
-      <w:numFmt w:val="decimal"/>
-      <w:lvlText w:val="%1.%2.%3.%4.%5.%6.%7.%8.%9."/>
-      <w:lvlJc w:val="left"/>
-      <w:pPr>
-        <w:tabs>
-          <w:tab w:val="num" w:pos="0"/>
-        </w:tabs>
-        <w:ind w:left="4320" w:hanging="1440"/>
-      </w:pPr>
-      <w:rPr/>
-    </w:lvl>
-  </w:abstractNum>
-  <w:abstractNum w:abstractNumId="13">
-    <w:lvl w:ilvl="0">
-      <w:start w:val="1"/>
-      <w:numFmt w:val="decimal"/>
-      <w:lvlText w:val="%1."/>
-      <w:lvlJc w:val="left"/>
-      <w:pPr>
-        <w:tabs>
-          <w:tab w:val="num" w:pos="0"/>
-        </w:tabs>
-        <w:ind w:left="360" w:hanging="360"/>
-      </w:pPr>
-      <w:rPr/>
-    </w:lvl>
-    <w:lvl w:ilvl="1">
-      <w:start w:val="1"/>
-      <w:numFmt w:val="decimal"/>
-      <w:lvlText w:val="%1.%2."/>
-      <w:lvlJc w:val="left"/>
-      <w:pPr>
-        <w:tabs>
-          <w:tab w:val="num" w:pos="0"/>
-        </w:tabs>
-        <w:ind w:left="792" w:hanging="432"/>
-      </w:pPr>
-      <w:rPr/>
-    </w:lvl>
-    <w:lvl w:ilvl="2">
-      <w:start w:val="1"/>
-      <w:numFmt w:val="decimal"/>
-      <w:lvlText w:val="%1.%2.%3."/>
-      <w:lvlJc w:val="left"/>
-      <w:pPr>
-        <w:tabs>
-          <w:tab w:val="num" w:pos="0"/>
-        </w:tabs>
-        <w:ind w:left="1224" w:hanging="504"/>
-      </w:pPr>
-      <w:rPr>
-        <w:smallCaps w:val="false"/>
-        <w:caps w:val="false"/>
-        <w:dstrike w:val="false"/>
-        <w:strike w:val="false"/>
-        <w:vertAlign w:val="baseline"/>
-        <w:position w:val="0"/>
-        <w:sz w:val="20"/>
-        <w:sz w:val="20"/>
-        <w:spacing w:val="0"/>
-        <w:i w:val="false"/>
-        <w:u w:val="none"/>
-        <w:b w:val="false"/>
-        <w:kern w:val="0"/>
-        <w:iCs w:val="false"/>
-        <w:bCs w:val="false"/>
-        <w:em w:val="none"/>
-        <w:vanish w:val="false"/>
-        <w:color w:val="000000"/>
-        <w14:shadow w14:blurRad="0" w14:dist="0" w14:dir="0" w14:sx="0" w14:sy="0" w14:kx="0" w14:ky="0" w14:algn="none">
-          <w14:srgbClr w14:val="000000"/>
-        </w14:shadow>
-        <w14:textOutline w14:w="0" w14:cap="rnd" w14:cmpd="sng" w14:algn="ctr">
-          <w14:noFill/>
-          <w14:prstDash w14:val="solid"/>
-          <w14:bevel/>
-        </w14:textOutline>
-      </w:rPr>
-    </w:lvl>
-    <w:lvl w:ilvl="3">
-      <w:start w:val="1"/>
-      <w:numFmt w:val="decimal"/>
-      <w:lvlText w:val="%1.%2.%3.%4."/>
-      <w:lvlJc w:val="left"/>
-      <w:pPr>
-        <w:tabs>
-          <w:tab w:val="num" w:pos="0"/>
-        </w:tabs>
-        <w:ind w:left="1728" w:hanging="648"/>
-      </w:pPr>
-      <w:rPr>
-        <w:smallCaps w:val="false"/>
-        <w:caps w:val="false"/>
-        <w:dstrike w:val="false"/>
-        <w:strike w:val="false"/>
-        <w:vertAlign w:val="baseline"/>
-        <w:position w:val="0"/>
-        <w:sz w:val="20"/>
-        <w:sz w:val="20"/>
-        <w:spacing w:val="0"/>
-        <w:i w:val="false"/>
-        <w:u w:val="none"/>
-        <w:b w:val="false"/>
-        <w:kern w:val="0"/>
-        <w:iCs w:val="false"/>
-        <w:bCs w:val="false"/>
-        <w:em w:val="none"/>
-        <w:vanish w:val="false"/>
-        <w:color w:val="000000"/>
-        <w14:shadow w14:blurRad="0" w14:dist="0" w14:dir="0" w14:sx="0" w14:sy="0" w14:kx="0" w14:ky="0" w14:algn="none">
-          <w14:srgbClr w14:val="000000"/>
-        </w14:shadow>
-        <w14:textOutline w14:w="0" w14:cap="rnd" w14:cmpd="sng" w14:algn="ctr">
-          <w14:noFill/>
-          <w14:prstDash w14:val="solid"/>
-          <w14:bevel/>
-        </w14:textOutline>
-      </w:rPr>
-    </w:lvl>
-    <w:lvl w:ilvl="4">
-      <w:start w:val="1"/>
-      <w:numFmt w:val="decimal"/>
-      <w:lvlText w:val="%1.%2.%3.%4.%5."/>
-      <w:lvlJc w:val="left"/>
-      <w:pPr>
-        <w:tabs>
-          <w:tab w:val="num" w:pos="0"/>
-        </w:tabs>
-        <w:ind w:left="2232" w:hanging="792"/>
-      </w:pPr>
-      <w:rPr/>
-    </w:lvl>
-    <w:lvl w:ilvl="5">
-      <w:start w:val="1"/>
-      <w:numFmt w:val="decimal"/>
-      <w:lvlText w:val="%1.%2.%3.%4.%5.%6."/>
-      <w:lvlJc w:val="left"/>
-      <w:pPr>
-        <w:tabs>
-          <w:tab w:val="num" w:pos="0"/>
-        </w:tabs>
-        <w:ind w:left="2736" w:hanging="936"/>
-      </w:pPr>
-      <w:rPr/>
-    </w:lvl>
-    <w:lvl w:ilvl="6">
-      <w:start w:val="1"/>
-      <w:numFmt w:val="decimal"/>
-      <w:lvlText w:val="%1.%2.%3.%4.%5.%6.%7."/>
-      <w:lvlJc w:val="left"/>
-      <w:pPr>
-        <w:tabs>
-          <w:tab w:val="num" w:pos="0"/>
-        </w:tabs>
-        <w:ind w:left="3240" w:hanging="1080"/>
-      </w:pPr>
-      <w:rPr/>
-    </w:lvl>
-    <w:lvl w:ilvl="7">
-      <w:start w:val="1"/>
-      <w:numFmt w:val="decimal"/>
-      <w:lvlText w:val="%1.%2.%3.%4.%5.%6.%7.%8."/>
-      <w:lvlJc w:val="left"/>
-      <w:pPr>
-        <w:tabs>
-          <w:tab w:val="num" w:pos="0"/>
-        </w:tabs>
-        <w:ind w:left="3744" w:hanging="1224"/>
-      </w:pPr>
-      <w:rPr/>
-    </w:lvl>
-    <w:lvl w:ilvl="8">
-      <w:start w:val="1"/>
-      <w:numFmt w:val="decimal"/>
-      <w:lvlText w:val="%1.%2.%3.%4.%5.%6.%7.%8.%9."/>
-      <w:lvlJc w:val="left"/>
-      <w:pPr>
-        <w:tabs>
-          <w:tab w:val="num" w:pos="0"/>
-        </w:tabs>
-        <w:ind w:left="4320" w:hanging="1440"/>
-      </w:pPr>
-      <w:rPr/>
-    </w:lvl>
-  </w:abstractNum>
-  <w:abstractNum w:abstractNumId="14">
+  <w:abstractNum w:abstractNumId="10">
     <w:lvl w:ilvl="0">
       <w:start w:val="1"/>
       <w:numFmt w:val="decimal"/>
@@ -7933,16 +6812,16 @@
     <w:abstractNumId w:val="10"/>
   </w:num>
   <w:num w:numId="11">
-    <w:abstractNumId w:val="11"/>
+    <w:abstractNumId w:val="1"/>
   </w:num>
   <w:num w:numId="12">
-    <w:abstractNumId w:val="12"/>
+    <w:abstractNumId w:val="1"/>
   </w:num>
   <w:num w:numId="13">
-    <w:abstractNumId w:val="13"/>
+    <w:abstractNumId w:val="1"/>
   </w:num>
   <w:num w:numId="14">
-    <w:abstractNumId w:val="14"/>
+    <w:abstractNumId w:val="1"/>
   </w:num>
   <w:num w:numId="15">
     <w:abstractNumId w:val="1"/>
@@ -7951,24 +6830,6 @@
     <w:abstractNumId w:val="1"/>
   </w:num>
   <w:num w:numId="17">
-    <w:abstractNumId w:val="1"/>
-  </w:num>
-  <w:num w:numId="18">
-    <w:abstractNumId w:val="1"/>
-  </w:num>
-  <w:num w:numId="19">
-    <w:abstractNumId w:val="1"/>
-  </w:num>
-  <w:num w:numId="20">
-    <w:abstractNumId w:val="1"/>
-  </w:num>
-  <w:num w:numId="21">
-    <w:abstractNumId w:val="1"/>
-  </w:num>
-  <w:num w:numId="22">
-    <w:abstractNumId w:val="1"/>
-  </w:num>
-  <w:num w:numId="23">
     <w:abstractNumId w:val="1"/>
   </w:num>
 </w:numbering>

</xml_diff>